<commit_message>
Esignature feature for RecoApproHR
</commit_message>
<xml_diff>
--- a/public/assets/WORDFORM-6.docx
+++ b/public/assets/WORDFORM-6.docx
@@ -7056,7 +7056,7 @@
           <w:sz w:val="2"/>
         </w:rPr>
         <w:pict w14:anchorId="7A56A719">
-          <v:rect id="_x0000_s1037" style="position:absolute;margin-left:18.7pt;margin-top:626.1pt;width:311.3pt;height:137.5pt;z-index:9;mso-position-horizontal-relative:text;mso-position-vertical-relative:page" filled="f" strokeweight="1pt">
+          <v:rect id="_x0000_s1037" style="position:absolute;margin-left:18.7pt;margin-top:626.1pt;width:311.3pt;height:137.5pt;z-index:8;mso-position-horizontal-relative:text;mso-position-vertical-relative:page" filled="f" strokeweight="1pt">
             <w10:wrap anchory="page"/>
           </v:rect>
         </w:pict>
@@ -7130,6 +7130,9 @@
     </w:p>
     <w:p>
       <w:pPr>
+        <w:tabs>
+          <w:tab w:val="left" w:pos="7903"/>
+        </w:tabs>
         <w:rPr>
           <w:rFonts w:ascii="Arial"/>
           <w:sz w:val="2"/>
@@ -7147,6 +7150,13 @@
             <w10:wrap anchory="page"/>
           </v:rect>
         </w:pict>
+      </w:r>
+      <w:r>
+        <w:rPr>
+          <w:rFonts w:ascii="Arial"/>
+          <w:sz w:val="2"/>
+        </w:rPr>
+        <w:tab/>
       </w:r>
     </w:p>
     <w:p>
@@ -7319,7 +7329,7 @@
             <v:stroke joinstyle="miter"/>
             <v:path gradientshapeok="t" o:connecttype="rect"/>
           </v:shapetype>
-          <v:shape id="_x0000_s1055" type="#_x0000_t202" style="position:absolute;left:0;text-align:left;margin-left:126.4pt;margin-top:21.9pt;width:238.6pt;height:27.6pt;z-index:15;mso-position-horizontal-relative:text;mso-position-vertical-relative:text" filled="f" stroked="f">
+          <v:shape id="_x0000_s1055" type="#_x0000_t202" style="position:absolute;left:0;text-align:left;margin-left:126.4pt;margin-top:21.9pt;width:238.6pt;height:27.6pt;z-index:14;mso-position-horizontal-relative:text;mso-position-vertical-relative:text" filled="f" stroked="f">
             <v:textbox style="mso-next-textbox:#_x0000_s1055">
               <w:txbxContent>
                 <w:p>
@@ -7411,6 +7421,52 @@
           <w:noProof/>
           <w:sz w:val="2"/>
         </w:rPr>
+        <w:pict w14:anchorId="741AC87E">
+          <v:shape id="_x0000_s1064" type="#_x0000_t202" style="position:absolute;left:0;text-align:left;margin-left:51.1pt;margin-top:12.95pt;width:149.6pt;height:33.2pt;z-index:22;mso-position-horizontal-relative:text;mso-position-vertical-relative:text" filled="f" stroked="f">
+            <v:textbox style="mso-next-textbox:#_x0000_s1064">
+              <w:txbxContent>
+                <w:p>
+                  <w:pPr>
+                    <w:rPr>
+                      <w:sz w:val="18"/>
+                      <w:szCs w:val="18"/>
+                    </w:rPr>
+                  </w:pPr>
+                  <w:r>
+                    <w:rPr>
+                      <w:sz w:val="18"/>
+                      <w:szCs w:val="18"/>
+                    </w:rPr>
+                    <w:t>${</w:t>
+                  </w:r>
+                  <w:proofErr w:type="spellStart"/>
+                  <w:r>
+                    <w:rPr>
+                      <w:sz w:val="18"/>
+                      <w:szCs w:val="18"/>
+                    </w:rPr>
+                    <w:t>vacation_specify</w:t>
+                  </w:r>
+                  <w:proofErr w:type="spellEnd"/>
+                  <w:r>
+                    <w:rPr>
+                      <w:sz w:val="18"/>
+                      <w:szCs w:val="18"/>
+                    </w:rPr>
+                    <w:t>}</w:t>
+                  </w:r>
+                </w:p>
+              </w:txbxContent>
+            </v:textbox>
+          </v:shape>
+        </w:pict>
+      </w:r>
+      <w:r>
+        <w:rPr>
+          <w:rFonts w:ascii="Arial"/>
+          <w:noProof/>
+          <w:sz w:val="2"/>
+        </w:rPr>
         <w:pict w14:anchorId="5DD82279">
           <v:shapetype id="_x0000_t34" coordsize="21600,21600" o:spt="34" o:oned="t" adj="10800" path="m,l@0,0@0,21600,21600,21600e" filled="f">
             <v:stroke joinstyle="miter"/>
@@ -7423,7 +7479,7 @@
             </v:handles>
             <o:lock v:ext="edit" shapetype="t"/>
           </v:shapetype>
-          <v:shape id="_x0000_s1056" type="#_x0000_t34" style="position:absolute;left:0;text-align:left;margin-left:50pt;margin-top:32.4pt;width:144.2pt;height:.05pt;z-index:16" o:connectortype="elbow" adj=",-129146400,-64852"/>
+          <v:shape id="_x0000_s1056" type="#_x0000_t34" style="position:absolute;left:0;text-align:left;margin-left:50pt;margin-top:32.4pt;width:144.2pt;height:.05pt;z-index:15" o:connectortype="elbow" adj=",-129146400,-64852"/>
         </w:pict>
       </w:r>
       <w:r>
@@ -7433,7 +7489,7 @@
           <w:sz w:val="2"/>
         </w:rPr>
         <w:pict w14:anchorId="741AC87E">
-          <v:shape id="_x0000_s1065" type="#_x0000_t202" style="position:absolute;left:0;text-align:left;margin-left:91.1pt;margin-top:41.65pt;width:116.4pt;height:33.2pt;z-index:24;mso-position-horizontal-relative:text;mso-position-vertical-relative:text" filled="f" stroked="f">
+          <v:shape id="_x0000_s1065" type="#_x0000_t202" style="position:absolute;left:0;text-align:left;margin-left:91.1pt;margin-top:41.65pt;width:116.4pt;height:33.2pt;z-index:23;mso-position-horizontal-relative:text;mso-position-vertical-relative:text" filled="f" stroked="f">
             <v:textbox style="mso-next-textbox:#_x0000_s1065">
               <w:txbxContent>
                 <w:p>
@@ -7478,58 +7534,12 @@
           <w:noProof/>
           <w:sz w:val="2"/>
         </w:rPr>
-        <w:pict w14:anchorId="741AC87E">
-          <v:shape id="_x0000_s1064" type="#_x0000_t202" style="position:absolute;left:0;text-align:left;margin-left:46pt;margin-top:10.6pt;width:86.45pt;height:33.2pt;z-index:23;mso-position-horizontal-relative:text;mso-position-vertical-relative:text" filled="f" stroked="f">
-            <v:textbox style="mso-next-textbox:#_x0000_s1064">
-              <w:txbxContent>
-                <w:p>
-                  <w:pPr>
-                    <w:rPr>
-                      <w:sz w:val="18"/>
-                      <w:szCs w:val="18"/>
-                    </w:rPr>
-                  </w:pPr>
-                  <w:r>
-                    <w:rPr>
-                      <w:sz w:val="18"/>
-                      <w:szCs w:val="18"/>
-                    </w:rPr>
-                    <w:t>${</w:t>
-                  </w:r>
-                  <w:proofErr w:type="spellStart"/>
-                  <w:r>
-                    <w:rPr>
-                      <w:sz w:val="18"/>
-                      <w:szCs w:val="18"/>
-                    </w:rPr>
-                    <w:t>vacation_specify</w:t>
-                  </w:r>
-                  <w:proofErr w:type="spellEnd"/>
-                  <w:r>
-                    <w:rPr>
-                      <w:sz w:val="18"/>
-                      <w:szCs w:val="18"/>
-                    </w:rPr>
-                    <w:t>}</w:t>
-                  </w:r>
-                </w:p>
-              </w:txbxContent>
-            </v:textbox>
-          </v:shape>
-        </w:pict>
-      </w:r>
-      <w:r>
-        <w:rPr>
-          <w:rFonts w:ascii="Arial"/>
-          <w:noProof/>
-          <w:sz w:val="2"/>
-        </w:rPr>
         <w:pict w14:anchorId="5DD82279">
           <v:shapetype id="_x0000_t32" coordsize="21600,21600" o:spt="32" o:oned="t" path="m,l21600,21600e" filled="f">
             <v:path arrowok="t" fillok="f" o:connecttype="none"/>
             <o:lock v:ext="edit" shapetype="t"/>
           </v:shapetype>
-          <v:shape id="_x0000_s1057" type="#_x0000_t32" style="position:absolute;left:0;text-align:left;margin-left:73.1pt;margin-top:20.2pt;width:119.85pt;height:0;z-index:17" o:connectortype="elbow" adj="-82192,-1,-82192"/>
+          <v:shape id="_x0000_s1057" type="#_x0000_t32" style="position:absolute;left:0;text-align:left;margin-left:73.1pt;margin-top:20.2pt;width:119.85pt;height:0;z-index:16" o:connectortype="elbow" adj="-82192,-1,-82192"/>
         </w:pict>
       </w:r>
     </w:p>
@@ -7739,7 +7749,7 @@
           <w:sz w:val="2"/>
         </w:rPr>
         <w:pict w14:anchorId="741AC87E">
-          <v:shape id="_x0000_s1066" type="#_x0000_t202" style="position:absolute;left:0;text-align:left;margin-left:-16pt;margin-top:44.45pt;width:118.95pt;height:38.75pt;z-index:25;mso-position-horizontal-relative:text;mso-position-vertical-relative:text" filled="f" stroked="f">
+          <v:shape id="_x0000_s1066" type="#_x0000_t202" style="position:absolute;left:0;text-align:left;margin-left:-16pt;margin-top:44.45pt;width:118.95pt;height:38.75pt;z-index:24;mso-position-horizontal-relative:text;mso-position-vertical-relative:text" filled="f" stroked="f">
             <v:textbox style="mso-next-textbox:#_x0000_s1066">
               <w:txbxContent>
                 <w:p>
@@ -7801,7 +7811,7 @@
           <w:sz w:val="2"/>
         </w:rPr>
         <w:pict w14:anchorId="5DD82279">
-          <v:shape id="_x0000_s1058" type="#_x0000_t32" style="position:absolute;left:0;text-align:left;margin-left:-12.5pt;margin-top:5.1pt;width:88.2pt;height:0;z-index:18" o:connectortype="elbow" adj="-110559,-1,-110559"/>
+          <v:shape id="_x0000_s1058" type="#_x0000_t32" style="position:absolute;left:0;text-align:left;margin-left:-12.5pt;margin-top:5.1pt;width:88.2pt;height:0;z-index:17" o:connectortype="elbow" adj="-110559,-1,-110559"/>
         </w:pict>
       </w:r>
       <w:r>
@@ -7811,7 +7821,7 @@
           <w:sz w:val="2"/>
         </w:rPr>
         <w:pict w14:anchorId="314D41A7">
-          <v:shape id="_x0000_s1054" type="#_x0000_t202" style="position:absolute;left:0;text-align:left;margin-left:-136.45pt;margin-top:4.65pt;width:139.5pt;height:17.25pt;z-index:14;mso-position-horizontal-relative:text;mso-position-vertical-relative:text" filled="f" stroked="f">
+          <v:shape id="_x0000_s1054" type="#_x0000_t202" style="position:absolute;left:0;text-align:left;margin-left:-136.45pt;margin-top:4.65pt;width:139.5pt;height:17.25pt;z-index:13;mso-position-horizontal-relative:text;mso-position-vertical-relative:text" filled="f" stroked="f">
             <v:textbox style="mso-next-textbox:#_x0000_s1054">
               <w:txbxContent>
                 <w:p>
@@ -7952,7 +7962,7 @@
           <w:sz w:val="2"/>
         </w:rPr>
         <w:pict w14:anchorId="5DD82279">
-          <v:shape id="_x0000_s1060" type="#_x0000_t32" style="position:absolute;left:0;text-align:left;margin-left:77.45pt;margin-top:17.6pt;width:104.3pt;height:0;z-index:20" o:connectortype="elbow" adj="-95761,-1,-95761"/>
+          <v:shape id="_x0000_s1060" type="#_x0000_t32" style="position:absolute;left:0;text-align:left;margin-left:77.45pt;margin-top:17.6pt;width:104.3pt;height:0;z-index:19" o:connectortype="elbow" adj="-95761,-1,-95761"/>
         </w:pict>
       </w:r>
       <w:r>
@@ -7962,7 +7972,7 @@
           <w:sz w:val="2"/>
         </w:rPr>
         <w:pict w14:anchorId="5DD82279">
-          <v:shape id="_x0000_s1059" type="#_x0000_t32" style="position:absolute;left:0;text-align:left;margin-left:88.4pt;margin-top:4.75pt;width:93.35pt;height:0;z-index:19" o:connectortype="elbow" adj="-109527,-1,-109527"/>
+          <v:shape id="_x0000_s1059" type="#_x0000_t32" style="position:absolute;left:0;text-align:left;margin-left:88.4pt;margin-top:4.75pt;width:93.35pt;height:0;z-index:18" o:connectortype="elbow" adj="-109527,-1,-109527"/>
         </w:pict>
       </w:r>
       <w:r>
@@ -7972,7 +7982,7 @@
           <w:sz w:val="2"/>
         </w:rPr>
         <w:pict w14:anchorId="741AC87E">
-          <v:shape id="_x0000_s1067" type="#_x0000_t202" style="position:absolute;left:0;text-align:left;margin-left:35.4pt;margin-top:34.6pt;width:152.95pt;height:46.5pt;z-index:26;mso-position-horizontal-relative:text;mso-position-vertical-relative:text" filled="f" stroked="f">
+          <v:shape id="_x0000_s1067" type="#_x0000_t202" style="position:absolute;left:0;text-align:left;margin-left:35.4pt;margin-top:34.6pt;width:152.95pt;height:46.5pt;z-index:25;mso-position-horizontal-relative:text;mso-position-vertical-relative:text" filled="f" stroked="f">
             <v:textbox style="mso-next-textbox:#_x0000_s1067">
               <w:txbxContent>
                 <w:p>
@@ -8034,7 +8044,7 @@
           <w:sz w:val="2"/>
         </w:rPr>
         <w:pict w14:anchorId="5DD82279">
-          <v:shape id="_x0000_s1062" type="#_x0000_t32" style="position:absolute;left:0;text-align:left;margin-left:70.05pt;margin-top:14.5pt;width:146.9pt;height:0;z-index:22" o:connectortype="elbow" adj="-63263,-1,-63263"/>
+          <v:shape id="_x0000_s1062" type="#_x0000_t32" style="position:absolute;left:0;text-align:left;margin-left:70.05pt;margin-top:14.5pt;width:146.9pt;height:0;z-index:21" o:connectortype="elbow" adj="-63263,-1,-63263"/>
         </w:pict>
       </w:r>
       <w:r>
@@ -8044,7 +8054,7 @@
           <w:sz w:val="2"/>
         </w:rPr>
         <w:pict w14:anchorId="5DD82279">
-          <v:shape id="_x0000_s1061" type="#_x0000_t32" style="position:absolute;left:0;text-align:left;margin-left:70.05pt;margin-top:2.5pt;width:146.9pt;height:0;z-index:21" o:connectortype="elbow" adj="-63263,-1,-63263"/>
+          <v:shape id="_x0000_s1061" type="#_x0000_t32" style="position:absolute;left:0;text-align:left;margin-left:70.05pt;margin-top:2.5pt;width:146.9pt;height:0;z-index:20" o:connectortype="elbow" adj="-63263,-1,-63263"/>
         </w:pict>
       </w:r>
     </w:p>
@@ -8248,7 +8258,7 @@
           <w:sz w:val="2"/>
         </w:rPr>
         <w:pict w14:anchorId="4FD96711">
-          <v:shape id="_x0000_s1051" type="#_x0000_t32" style="position:absolute;left:0;text-align:left;margin-left:397.15pt;margin-top:4.35pt;width:125.65pt;height:0;z-index:12" o:connectortype="elbow" adj="-19735,-1,-19735"/>
+          <v:shape id="_x0000_s1051" type="#_x0000_t32" style="position:absolute;left:0;text-align:left;margin-left:397.15pt;margin-top:4.35pt;width:125.65pt;height:0;z-index:11" o:connectortype="elbow" adj="-19735,-1,-19735"/>
         </w:pict>
       </w:r>
     </w:p>
@@ -8307,7 +8317,7 @@
           <w:sz w:val="2"/>
         </w:rPr>
         <w:pict w14:anchorId="76C51F85">
-          <v:shape id="_x0000_s1053" type="#_x0000_t32" style="position:absolute;left:0;text-align:left;margin-left:399.1pt;margin-top:3.85pt;width:125.8pt;height:0;z-index:13" o:connectortype="elbow" adj="-7529,-1,-7529"/>
+          <v:shape id="_x0000_s1053" type="#_x0000_t32" style="position:absolute;left:0;text-align:left;margin-left:399.1pt;margin-top:3.85pt;width:125.8pt;height:0;z-index:12" o:connectortype="elbow" adj="-7529,-1,-7529"/>
         </w:pict>
       </w:r>
       <w:r>
@@ -8317,7 +8327,7 @@
           <w:sz w:val="2"/>
         </w:rPr>
         <w:pict w14:anchorId="4FD96711">
-          <v:shape id="_x0000_s1049" type="#_x0000_t32" style="position:absolute;left:0;text-align:left;margin-left:41.05pt;margin-top:3.85pt;width:125.65pt;height:0;z-index:10" o:connectortype="elbow" adj="-19735,-1,-19735"/>
+          <v:shape id="_x0000_s1049" type="#_x0000_t32" style="position:absolute;left:0;text-align:left;margin-left:41.05pt;margin-top:3.85pt;width:125.65pt;height:0;z-index:9" o:connectortype="elbow" adj="-19735,-1,-19735"/>
         </w:pict>
       </w:r>
     </w:p>
@@ -8428,7 +8438,7 @@
           <w:sz w:val="2"/>
         </w:rPr>
         <w:pict w14:anchorId="4FD96711">
-          <v:shape id="_x0000_s1050" type="#_x0000_t32" style="position:absolute;left:0;text-align:left;margin-left:401.25pt;margin-top:9.8pt;width:125.65pt;height:0;z-index:11" o:connectortype="elbow" adj="-19735,-1,-19735"/>
+          <v:shape id="_x0000_s1050" type="#_x0000_t32" style="position:absolute;left:0;text-align:left;margin-left:401.25pt;margin-top:9.8pt;width:125.65pt;height:0;z-index:10" o:connectortype="elbow" adj="-19735,-1,-19735"/>
         </w:pict>
       </w:r>
     </w:p>
@@ -8606,7 +8616,7 @@
     </w:p>
     <w:p>
       <w:pPr>
-        <w:framePr w:w="4666" w:wrap="auto" w:vAnchor="page" w:hAnchor="page" w:x="1191" w:y="14734"/>
+        <w:framePr w:w="4666" w:wrap="auto" w:vAnchor="page" w:hAnchor="page" w:x="1173" w:y="14803"/>
         <w:widowControl w:val="0"/>
         <w:autoSpaceDE w:val="0"/>
         <w:autoSpaceDN w:val="0"/>
@@ -8638,7 +8648,7 @@
     </w:p>
     <w:p>
       <w:pPr>
-        <w:framePr w:w="4442" w:wrap="auto" w:vAnchor="page" w:hAnchor="page" w:x="1030" w:y="14648"/>
+        <w:framePr w:w="4442" w:wrap="auto" w:vAnchor="page" w:hAnchor="page" w:x="1073" w:y="14703"/>
         <w:widowControl w:val="0"/>
         <w:autoSpaceDE w:val="0"/>
         <w:autoSpaceDN w:val="0"/>
@@ -8660,32 +8670,12 @@
           <w:color w:val="000000"/>
           <w:sz w:val="20"/>
         </w:rPr>
-        <w:t>${</w:t>
-      </w:r>
-      <w:r>
-        <w:rPr>
-          <w:rFonts w:ascii="EEPAMF+Calibri-Bold"/>
-          <w:b/>
-          <w:bCs/>
-          <w:color w:val="000000"/>
-          <w:sz w:val="20"/>
-        </w:rPr>
-        <w:t>VOLC</w:t>
-      </w:r>
-      <w:r>
-        <w:rPr>
-          <w:rFonts w:ascii="EEPAMF+Calibri-Bold"/>
-          <w:b/>
-          <w:bCs/>
-          <w:color w:val="000000"/>
-          <w:sz w:val="20"/>
-        </w:rPr>
-        <w:t>_NAME}</w:t>
-      </w:r>
-    </w:p>
-    <w:p>
-      <w:pPr>
-        <w:framePr w:w="4574" w:wrap="auto" w:vAnchor="page" w:hAnchor="page" w:x="940" w:y="14906"/>
+        <w:t>${VOLC_NAME}</w:t>
+      </w:r>
+    </w:p>
+    <w:p>
+      <w:pPr>
+        <w:framePr w:w="4574" w:wrap="auto" w:vAnchor="page" w:hAnchor="page" w:x="956" w:y="14987"/>
         <w:widowControl w:val="0"/>
         <w:autoSpaceDE w:val="0"/>
         <w:autoSpaceDN w:val="0"/>
@@ -8724,63 +8714,88 @@
     </w:p>
     <w:p>
       <w:pPr>
-        <w:rPr>
-          <w:rFonts w:ascii="Arial"/>
-          <w:sz w:val="2"/>
-        </w:rPr>
-      </w:pPr>
-      <w:r>
-        <w:rPr>
-          <w:rFonts w:ascii="Arial"/>
-          <w:noProof/>
-          <w:color w:val="FF0000"/>
-          <w:sz w:val="2"/>
-        </w:rPr>
-        <w:pict w14:anchorId="7A56A719">
-          <v:rect id="_x0000_s1036" style="position:absolute;left:0;text-align:left;margin-left:-303.4pt;margin-top:71.7pt;width:570pt;height:157.6pt;z-index:8;mso-position-horizontal-relative:text;mso-position-vertical-relative:text" filled="f" strokeweight="1pt"/>
-        </w:pict>
-      </w:r>
-    </w:p>
-    <w:p>
-      <w:pPr>
-        <w:rPr>
-          <w:rFonts w:ascii="Arial"/>
-          <w:sz w:val="2"/>
-        </w:rPr>
-      </w:pPr>
-    </w:p>
-    <w:p>
-      <w:pPr>
-        <w:rPr>
-          <w:rFonts w:ascii="Arial"/>
-          <w:sz w:val="2"/>
-        </w:rPr>
-      </w:pPr>
-    </w:p>
-    <w:p>
-      <w:pPr>
-        <w:framePr w:w="4424" w:wrap="auto" w:vAnchor="page" w:hAnchor="page" w:x="3957" w:y="17093"/>
+        <w:framePr w:w="4574" w:wrap="auto" w:vAnchor="page" w:hAnchor="page" w:x="7034" w:y="14268"/>
         <w:widowControl w:val="0"/>
         <w:autoSpaceDE w:val="0"/>
         <w:autoSpaceDN w:val="0"/>
         <w:adjustRightInd w:val="0"/>
-        <w:spacing w:before="0" w:after="0" w:line="190" w:lineRule="exact"/>
+        <w:spacing w:before="26" w:after="0" w:line="211" w:lineRule="exact"/>
         <w:jc w:val="center"/>
         <w:rPr>
-          <w:rFonts w:ascii="IEVRAA+ArialMT"/>
           <w:color w:val="000000"/>
           <w:sz w:val="20"/>
-          <w:szCs w:val="20"/>
-        </w:rPr>
-      </w:pPr>
-      <w:r>
-        <w:rPr>
-          <w:rFonts w:ascii="IEVRAA+ArialMT"/>
+        </w:rPr>
+      </w:pPr>
+      <w:r>
+        <w:rPr>
+          <w:rFonts w:ascii="EEPAMF+Calibri-Bold"/>
           <w:color w:val="000000"/>
           <w:sz w:val="20"/>
-          <w:szCs w:val="20"/>
-        </w:rPr>
-        <w:t>${FINAL_POSITION}</w:t>
+        </w:rPr>
+        <w:t>${</w:t>
+      </w:r>
+      <w:r>
+        <w:rPr>
+          <w:rFonts w:ascii="EEPAMF+Calibri-Bold"/>
+          <w:color w:val="000000"/>
+          <w:sz w:val="20"/>
+        </w:rPr>
+        <w:t>RECOSIGN</w:t>
+      </w:r>
+      <w:r>
+        <w:rPr>
+          <w:rFonts w:ascii="EEPAMF+Calibri-Bold"/>
+          <w:color w:val="000000"/>
+          <w:sz w:val="20"/>
+        </w:rPr>
+        <w:t>}</w:t>
+      </w:r>
+    </w:p>
+    <w:p>
+      <w:pPr>
+        <w:framePr w:w="4574" w:wrap="auto" w:vAnchor="page" w:hAnchor="page" w:x="1056" w:y="14484"/>
+        <w:widowControl w:val="0"/>
+        <w:autoSpaceDE w:val="0"/>
+        <w:autoSpaceDN w:val="0"/>
+        <w:adjustRightInd w:val="0"/>
+        <w:spacing w:before="26" w:after="0" w:line="211" w:lineRule="exact"/>
+        <w:jc w:val="center"/>
+        <w:rPr>
+          <w:color w:val="000000"/>
+          <w:sz w:val="20"/>
+        </w:rPr>
+      </w:pPr>
+      <w:r>
+        <w:rPr>
+          <w:rFonts w:ascii="EEPAMF+Calibri-Bold"/>
+          <w:color w:val="000000"/>
+          <w:sz w:val="20"/>
+        </w:rPr>
+        <w:t>${</w:t>
+      </w:r>
+      <w:r>
+        <w:rPr>
+          <w:rFonts w:ascii="EEPAMF+Calibri-Bold"/>
+          <w:color w:val="000000"/>
+          <w:sz w:val="20"/>
+        </w:rPr>
+        <w:t>HR</w:t>
+      </w:r>
+      <w:r>
+        <w:rPr>
+          <w:rFonts w:ascii="EEPAMF+Calibri-Bold"/>
+          <w:color w:val="000000"/>
+          <w:sz w:val="20"/>
+        </w:rPr>
+        <w:t>SIGN</w:t>
+      </w:r>
+      <w:r>
+        <w:rPr>
+          <w:rFonts w:ascii="EEPAMF+Calibri-Bold"/>
+          <w:color w:val="000000"/>
+          <w:sz w:val="20"/>
+        </w:rPr>
+        <w:t>}</w:t>
       </w:r>
     </w:p>
     <w:p>
@@ -8825,15 +8840,84 @@
     </w:p>
     <w:p>
       <w:pPr>
-        <w:rPr>
-          <w:rFonts w:ascii="Arial"/>
-          <w:sz w:val="2"/>
-        </w:rPr>
-      </w:pPr>
-    </w:p>
-    <w:p>
-      <w:pPr>
-        <w:framePr w:w="2980" w:wrap="auto" w:vAnchor="page" w:hAnchor="page" w:x="4685" w:y="17619"/>
+        <w:framePr w:w="3975" w:wrap="auto" w:vAnchor="page" w:hAnchor="page" w:x="4095" w:y="17119"/>
+        <w:widowControl w:val="0"/>
+        <w:autoSpaceDE w:val="0"/>
+        <w:autoSpaceDN w:val="0"/>
+        <w:adjustRightInd w:val="0"/>
+        <w:spacing w:before="0" w:after="0" w:line="190" w:lineRule="exact"/>
+        <w:jc w:val="center"/>
+        <w:rPr>
+          <w:rFonts w:ascii="UDQAWB+Arial-BoldMT"/>
+          <w:b/>
+          <w:bCs/>
+          <w:color w:val="000000"/>
+          <w:sz w:val="20"/>
+          <w:szCs w:val="20"/>
+        </w:rPr>
+      </w:pPr>
+      <w:r>
+        <w:rPr>
+          <w:rFonts w:ascii="UDQAWB+Arial-BoldMT"/>
+          <w:b/>
+          <w:bCs/>
+          <w:color w:val="000000"/>
+          <w:sz w:val="20"/>
+          <w:szCs w:val="20"/>
+        </w:rPr>
+        <w:t>${FINAL_NAME}</w:t>
+      </w:r>
+    </w:p>
+    <w:p>
+      <w:pPr>
+        <w:framePr w:w="4574" w:wrap="auto" w:vAnchor="page" w:hAnchor="page" w:x="3819" w:y="16778"/>
+        <w:widowControl w:val="0"/>
+        <w:autoSpaceDE w:val="0"/>
+        <w:autoSpaceDN w:val="0"/>
+        <w:adjustRightInd w:val="0"/>
+        <w:spacing w:before="26" w:after="0" w:line="211" w:lineRule="exact"/>
+        <w:jc w:val="center"/>
+        <w:rPr>
+          <w:color w:val="000000"/>
+          <w:sz w:val="20"/>
+        </w:rPr>
+      </w:pPr>
+      <w:r>
+        <w:rPr>
+          <w:rFonts w:ascii="EEPAMF+Calibri-Bold"/>
+          <w:color w:val="000000"/>
+          <w:sz w:val="20"/>
+        </w:rPr>
+        <w:t>${</w:t>
+      </w:r>
+      <w:r>
+        <w:rPr>
+          <w:rFonts w:ascii="EEPAMF+Calibri-Bold"/>
+          <w:color w:val="000000"/>
+          <w:sz w:val="20"/>
+        </w:rPr>
+        <w:t>APPROVESIGN</w:t>
+      </w:r>
+      <w:r>
+        <w:rPr>
+          <w:rFonts w:ascii="EEPAMF+Calibri-Bold"/>
+          <w:color w:val="000000"/>
+          <w:sz w:val="20"/>
+        </w:rPr>
+        <w:t>}</w:t>
+      </w:r>
+    </w:p>
+    <w:p>
+      <w:pPr>
+        <w:rPr>
+          <w:rFonts w:ascii="Arial"/>
+          <w:sz w:val="2"/>
+        </w:rPr>
+      </w:pPr>
+    </w:p>
+    <w:p>
+      <w:pPr>
+        <w:framePr w:w="2980" w:wrap="auto" w:vAnchor="page" w:hAnchor="page" w:x="4688" w:y="17662"/>
         <w:widowControl w:val="0"/>
         <w:autoSpaceDE w:val="0"/>
         <w:autoSpaceDN w:val="0"/>
@@ -8856,7 +8940,7 @@
     </w:p>
     <w:p>
       <w:pPr>
-        <w:framePr w:w="3975" w:wrap="auto" w:vAnchor="page" w:hAnchor="page" w:x="4071" w:y="17406"/>
+        <w:framePr w:w="4424" w:wrap="auto" w:vAnchor="page" w:hAnchor="page" w:x="3902" w:y="17431"/>
         <w:widowControl w:val="0"/>
         <w:autoSpaceDE w:val="0"/>
         <w:autoSpaceDN w:val="0"/>
@@ -8864,9 +8948,7 @@
         <w:spacing w:before="0" w:after="0" w:line="190" w:lineRule="exact"/>
         <w:jc w:val="center"/>
         <w:rPr>
-          <w:rFonts w:ascii="UDQAWB+Arial-BoldMT"/>
-          <w:b/>
-          <w:bCs/>
+          <w:rFonts w:ascii="IEVRAA+ArialMT"/>
           <w:color w:val="000000"/>
           <w:sz w:val="20"/>
           <w:szCs w:val="20"/>
@@ -8874,27 +8956,25 @@
       </w:pPr>
       <w:r>
         <w:rPr>
-          <w:rFonts w:ascii="UDQAWB+Arial-BoldMT"/>
-          <w:b/>
-          <w:bCs/>
+          <w:rFonts w:ascii="IEVRAA+ArialMT"/>
           <w:color w:val="000000"/>
           <w:sz w:val="20"/>
           <w:szCs w:val="20"/>
         </w:rPr>
-        <w:t>${FINAL_NAME}</w:t>
-      </w:r>
-    </w:p>
-    <w:p>
-      <w:pPr>
-        <w:rPr>
-          <w:rFonts w:ascii="Arial"/>
-          <w:sz w:val="2"/>
-        </w:rPr>
-      </w:pPr>
-    </w:p>
-    <w:p>
-      <w:pPr>
-        <w:framePr w:w="5391" w:wrap="auto" w:vAnchor="page" w:hAnchor="page" w:x="3645" w:y="17945"/>
+        <w:t>${FINAL_POSITION}</w:t>
+      </w:r>
+    </w:p>
+    <w:p>
+      <w:pPr>
+        <w:rPr>
+          <w:rFonts w:ascii="Arial"/>
+          <w:sz w:val="2"/>
+        </w:rPr>
+      </w:pPr>
+    </w:p>
+    <w:p>
+      <w:pPr>
+        <w:framePr w:w="5391" w:wrap="auto" w:vAnchor="page" w:hAnchor="page" w:x="3832" w:y="17933"/>
         <w:widowControl w:val="0"/>
         <w:autoSpaceDE w:val="0"/>
         <w:autoSpaceDN w:val="0"/>

</xml_diff>

<commit_message>
Furnishing system Logic- UI not yet finish
</commit_message>
<xml_diff>
--- a/public/assets/WORDFORM-6.docx
+++ b/public/assets/WORDFORM-6.docx
@@ -1780,7 +1780,25 @@
           <w:spacing w:val="65"/>
           <w:sz w:val="15"/>
         </w:rPr>
-        <w:t xml:space="preserve">      </w:t>
+        <w:t xml:space="preserve">     </w:t>
+      </w:r>
+      <w:r>
+        <w:rPr>
+          <w:rFonts w:ascii="IEVRAA+ArialMT"/>
+          <w:color w:val="000000"/>
+          <w:spacing w:val="65"/>
+          <w:sz w:val="15"/>
+        </w:rPr>
+        <w:tab/>
+      </w:r>
+      <w:r>
+        <w:rPr>
+          <w:rFonts w:ascii="IEVRAA+ArialMT"/>
+          <w:color w:val="000000"/>
+          <w:spacing w:val="65"/>
+          <w:sz w:val="15"/>
+        </w:rPr>
+        <w:t xml:space="preserve"> </w:t>
       </w:r>
     </w:p>
     <w:p>
@@ -7433,15 +7451,7 @@
           <w:color w:val="000000"/>
           <w:sz w:val="18"/>
         </w:rPr>
-        <w:t xml:space="preserve"> </w:t>
-      </w:r>
-      <w:r>
-        <w:rPr>
-          <w:rFonts w:ascii="IEVRAA+ArialMT"/>
-          <w:color w:val="000000"/>
-          <w:sz w:val="18"/>
-        </w:rPr>
-        <w:t xml:space="preserve">  </w:t>
+        <w:t xml:space="preserve">   </w:t>
       </w:r>
       <w:proofErr w:type="gramEnd"/>
       <w:r>
@@ -7592,15 +7602,7 @@
           <w:color w:val="000000"/>
           <w:sz w:val="18"/>
         </w:rPr>
-        <w:t xml:space="preserve"> </w:t>
-      </w:r>
-      <w:r>
-        <w:rPr>
-          <w:rFonts w:ascii="IEVRAA+ArialMT"/>
-          <w:color w:val="000000"/>
-          <w:sz w:val="18"/>
-        </w:rPr>
-        <w:t xml:space="preserve">  </w:t>
+        <w:t xml:space="preserve">   </w:t>
       </w:r>
       <w:proofErr w:type="gramEnd"/>
       <w:r>
@@ -8480,6 +8482,490 @@
     </w:p>
     <w:p>
       <w:pPr>
+        <w:framePr w:w="6400" w:wrap="auto" w:vAnchor="page" w:hAnchor="page" w:x="958" w:y="9401"/>
+        <w:widowControl w:val="0"/>
+        <w:autoSpaceDE w:val="0"/>
+        <w:autoSpaceDN w:val="0"/>
+        <w:adjustRightInd w:val="0"/>
+        <w:spacing w:before="0" w:after="0" w:line="190" w:lineRule="exact"/>
+        <w:jc w:val="left"/>
+        <w:rPr>
+          <w:rFonts w:ascii="IEVRAA+ArialMT"/>
+          <w:color w:val="000000"/>
+          <w:sz w:val="14"/>
+          <w:szCs w:val="14"/>
+        </w:rPr>
+      </w:pPr>
+      <w:r>
+        <w:rPr>
+          <w:rFonts w:ascii="IEVRAA+ArialMT"/>
+          <w:color w:val="000000"/>
+          <w:sz w:val="18"/>
+          <w:szCs w:val="18"/>
+        </w:rPr>
+        <w:t>${</w:t>
+      </w:r>
+      <w:proofErr w:type="spellStart"/>
+      <w:r>
+        <w:rPr>
+          <w:rFonts w:ascii="IEVRAA+ArialMT"/>
+          <w:color w:val="000000"/>
+          <w:sz w:val="18"/>
+          <w:szCs w:val="18"/>
+        </w:rPr>
+        <w:t>type_</w:t>
+      </w:r>
+      <w:r>
+        <w:rPr>
+          <w:rFonts w:ascii="IEVRAA+ArialMT"/>
+          <w:color w:val="000000"/>
+          <w:sz w:val="18"/>
+          <w:szCs w:val="18"/>
+        </w:rPr>
+        <w:t>wellness</w:t>
+      </w:r>
+      <w:proofErr w:type="spellEnd"/>
+      <w:r>
+        <w:rPr>
+          <w:rFonts w:ascii="IEVRAA+ArialMT"/>
+          <w:color w:val="000000"/>
+          <w:sz w:val="18"/>
+          <w:szCs w:val="18"/>
+        </w:rPr>
+        <w:t>}</w:t>
+      </w:r>
+      <w:r>
+        <w:rPr>
+          <w:rFonts w:ascii="IEVRAA+ArialMT"/>
+          <w:color w:val="000000"/>
+          <w:sz w:val="14"/>
+          <w:szCs w:val="14"/>
+        </w:rPr>
+        <w:t xml:space="preserve"> </w:t>
+      </w:r>
+      <w:r>
+        <w:rPr>
+          <w:rFonts w:ascii="IEVRAA+ArialMT"/>
+          <w:color w:val="000000"/>
+          <w:sz w:val="14"/>
+          <w:szCs w:val="14"/>
+        </w:rPr>
+        <w:t>Wellness Leave</w:t>
+      </w:r>
+      <w:r>
+        <w:rPr>
+          <w:rFonts w:ascii="IEVRAA+ArialMT"/>
+          <w:color w:val="000000"/>
+          <w:sz w:val="14"/>
+          <w:szCs w:val="14"/>
+        </w:rPr>
+        <w:t xml:space="preserve"> </w:t>
+      </w:r>
+    </w:p>
+    <w:p>
+      <w:pPr>
+        <w:framePr w:w="4666" w:wrap="auto" w:vAnchor="page" w:hAnchor="page" w:x="830" w:y="11562"/>
+        <w:widowControl w:val="0"/>
+        <w:autoSpaceDE w:val="0"/>
+        <w:autoSpaceDN w:val="0"/>
+        <w:adjustRightInd w:val="0"/>
+        <w:spacing w:before="0" w:after="0" w:line="190" w:lineRule="exact"/>
+        <w:jc w:val="left"/>
+        <w:rPr>
+          <w:rFonts w:ascii="IEVRAA+ArialMT"/>
+          <w:color w:val="000000"/>
+          <w:sz w:val="18"/>
+        </w:rPr>
+      </w:pPr>
+      <w:r>
+        <w:rPr>
+          <w:rFonts w:ascii="IEVRAA+ArialMT"/>
+          <w:color w:val="000000"/>
+          <w:sz w:val="18"/>
+        </w:rPr>
+        <w:t>__________________________________</w:t>
+      </w:r>
+    </w:p>
+    <w:p>
+      <w:pPr>
+        <w:framePr w:w="1237" w:wrap="auto" w:vAnchor="page" w:hAnchor="page" w:x="3261" w:y="13613"/>
+        <w:widowControl w:val="0"/>
+        <w:autoSpaceDE w:val="0"/>
+        <w:autoSpaceDN w:val="0"/>
+        <w:adjustRightInd w:val="0"/>
+        <w:spacing w:before="0" w:after="0" w:line="211" w:lineRule="exact"/>
+        <w:jc w:val="left"/>
+        <w:rPr>
+          <w:rFonts w:ascii="EEPAMF+Calibri-Bold"/>
+          <w:color w:val="000000"/>
+          <w:sz w:val="20"/>
+        </w:rPr>
+      </w:pPr>
+      <w:r>
+        <w:rPr>
+          <w:rFonts w:ascii="EEPAMF+Calibri-Bold"/>
+          <w:color w:val="000000"/>
+          <w:sz w:val="20"/>
+        </w:rPr>
+        <w:t>${</w:t>
+      </w:r>
+      <w:r>
+        <w:rPr>
+          <w:rFonts w:ascii="EEPAMF+Calibri-Bold"/>
+          <w:color w:val="000000"/>
+          <w:sz w:val="20"/>
+        </w:rPr>
+        <w:t>VL_CREDIT</w:t>
+      </w:r>
+      <w:r>
+        <w:rPr>
+          <w:rFonts w:ascii="EEPAMF+Calibri-Bold"/>
+          <w:color w:val="000000"/>
+          <w:sz w:val="20"/>
+        </w:rPr>
+        <w:t>}</w:t>
+      </w:r>
+    </w:p>
+    <w:p>
+      <w:pPr>
+        <w:framePr w:w="1685" w:wrap="auto" w:vAnchor="page" w:hAnchor="page" w:x="3262" w:y="13884"/>
+        <w:widowControl w:val="0"/>
+        <w:autoSpaceDE w:val="0"/>
+        <w:autoSpaceDN w:val="0"/>
+        <w:adjustRightInd w:val="0"/>
+        <w:spacing w:before="0" w:after="0" w:line="211" w:lineRule="exact"/>
+        <w:jc w:val="left"/>
+        <w:rPr>
+          <w:rFonts w:ascii="EEPAMF+Calibri-Bold"/>
+          <w:color w:val="000000"/>
+          <w:sz w:val="20"/>
+        </w:rPr>
+      </w:pPr>
+      <w:r>
+        <w:rPr>
+          <w:rFonts w:ascii="EEPAMF+Calibri-Bold"/>
+          <w:color w:val="000000"/>
+          <w:sz w:val="20"/>
+        </w:rPr>
+        <w:t>${</w:t>
+      </w:r>
+      <w:r>
+        <w:rPr>
+          <w:rFonts w:ascii="EEPAMF+Calibri-Bold"/>
+          <w:color w:val="000000"/>
+          <w:sz w:val="20"/>
+        </w:rPr>
+        <w:t>LESSVL_CREDIT</w:t>
+      </w:r>
+      <w:r>
+        <w:rPr>
+          <w:rFonts w:ascii="EEPAMF+Calibri-Bold"/>
+          <w:color w:val="000000"/>
+          <w:sz w:val="20"/>
+        </w:rPr>
+        <w:t>}</w:t>
+      </w:r>
+    </w:p>
+    <w:p>
+      <w:pPr>
+        <w:framePr w:w="1479" w:wrap="auto" w:vAnchor="page" w:hAnchor="page" w:x="3275" w:y="14156"/>
+        <w:widowControl w:val="0"/>
+        <w:autoSpaceDE w:val="0"/>
+        <w:autoSpaceDN w:val="0"/>
+        <w:adjustRightInd w:val="0"/>
+        <w:spacing w:before="0" w:after="0" w:line="211" w:lineRule="exact"/>
+        <w:jc w:val="left"/>
+        <w:rPr>
+          <w:rFonts w:ascii="EEPAMF+Calibri-Bold"/>
+          <w:color w:val="000000"/>
+          <w:sz w:val="20"/>
+        </w:rPr>
+      </w:pPr>
+      <w:r>
+        <w:rPr>
+          <w:rFonts w:ascii="EEPAMF+Calibri-Bold"/>
+          <w:color w:val="000000"/>
+          <w:sz w:val="20"/>
+        </w:rPr>
+        <w:t>${</w:t>
+      </w:r>
+      <w:r>
+        <w:rPr>
+          <w:rFonts w:ascii="EEPAMF+Calibri-Bold"/>
+          <w:color w:val="000000"/>
+          <w:sz w:val="20"/>
+        </w:rPr>
+        <w:t>VL_BALANCE</w:t>
+      </w:r>
+      <w:r>
+        <w:rPr>
+          <w:rFonts w:ascii="EEPAMF+Calibri-Bold"/>
+          <w:color w:val="000000"/>
+          <w:sz w:val="20"/>
+        </w:rPr>
+        <w:t>}</w:t>
+      </w:r>
+    </w:p>
+    <w:p>
+      <w:pPr>
+        <w:framePr w:w="1479" w:wrap="auto" w:vAnchor="page" w:hAnchor="page" w:x="4891" w:y="13599"/>
+        <w:widowControl w:val="0"/>
+        <w:autoSpaceDE w:val="0"/>
+        <w:autoSpaceDN w:val="0"/>
+        <w:adjustRightInd w:val="0"/>
+        <w:spacing w:before="0" w:after="0" w:line="211" w:lineRule="exact"/>
+        <w:jc w:val="left"/>
+        <w:rPr>
+          <w:rFonts w:ascii="EEPAMF+Calibri-Bold"/>
+          <w:color w:val="000000"/>
+          <w:sz w:val="20"/>
+        </w:rPr>
+      </w:pPr>
+      <w:r>
+        <w:rPr>
+          <w:rFonts w:ascii="EEPAMF+Calibri-Bold"/>
+          <w:color w:val="000000"/>
+          <w:sz w:val="20"/>
+        </w:rPr>
+        <w:t>${</w:t>
+      </w:r>
+      <w:r>
+        <w:rPr>
+          <w:rFonts w:ascii="EEPAMF+Calibri-Bold"/>
+          <w:color w:val="000000"/>
+          <w:sz w:val="20"/>
+        </w:rPr>
+        <w:t>SL_</w:t>
+      </w:r>
+      <w:r>
+        <w:rPr>
+          <w:rFonts w:ascii="EEPAMF+Calibri-Bold" w:cs="IEVRAA+ArialMT"/>
+          <w:color w:val="000000"/>
+          <w:sz w:val="20"/>
+        </w:rPr>
+        <w:t>CREDIT</w:t>
+      </w:r>
+      <w:r>
+        <w:rPr>
+          <w:rFonts w:ascii="EEPAMF+Calibri-Bold"/>
+          <w:color w:val="000000"/>
+          <w:sz w:val="20"/>
+        </w:rPr>
+        <w:t>}</w:t>
+      </w:r>
+    </w:p>
+    <w:p>
+      <w:pPr>
+        <w:framePr w:w="2609" w:wrap="auto" w:vAnchor="page" w:hAnchor="page" w:x="4892" w:y="13858"/>
+        <w:widowControl w:val="0"/>
+        <w:autoSpaceDE w:val="0"/>
+        <w:autoSpaceDN w:val="0"/>
+        <w:adjustRightInd w:val="0"/>
+        <w:spacing w:before="0" w:after="0" w:line="211" w:lineRule="exact"/>
+        <w:jc w:val="left"/>
+        <w:rPr>
+          <w:rFonts w:ascii="EEPAMF+Calibri-Bold" w:cs="IEVRAA+ArialMT"/>
+          <w:color w:val="000000"/>
+          <w:sz w:val="20"/>
+        </w:rPr>
+      </w:pPr>
+      <w:r>
+        <w:rPr>
+          <w:rFonts w:ascii="EEPAMF+Calibri-Bold" w:cs="IEVRAA+ArialMT"/>
+          <w:color w:val="000000"/>
+          <w:sz w:val="20"/>
+        </w:rPr>
+        <w:t>${LESSSL_CREDIT}</w:t>
+      </w:r>
+    </w:p>
+    <w:p>
+      <w:pPr>
+        <w:framePr w:w="1479" w:wrap="auto" w:vAnchor="page" w:hAnchor="page" w:x="4891" w:y="14143"/>
+        <w:widowControl w:val="0"/>
+        <w:autoSpaceDE w:val="0"/>
+        <w:autoSpaceDN w:val="0"/>
+        <w:adjustRightInd w:val="0"/>
+        <w:spacing w:before="0" w:after="0" w:line="211" w:lineRule="exact"/>
+        <w:jc w:val="left"/>
+        <w:rPr>
+          <w:rFonts w:ascii="EEPAMF+Calibri-Bold"/>
+          <w:color w:val="000000"/>
+          <w:sz w:val="20"/>
+        </w:rPr>
+      </w:pPr>
+      <w:r>
+        <w:rPr>
+          <w:rFonts w:ascii="EEPAMF+Calibri-Bold"/>
+          <w:color w:val="000000"/>
+          <w:sz w:val="20"/>
+        </w:rPr>
+        <w:t>${</w:t>
+      </w:r>
+      <w:r>
+        <w:rPr>
+          <w:rFonts w:ascii="EEPAMF+Calibri-Bold"/>
+          <w:color w:val="000000"/>
+          <w:sz w:val="20"/>
+        </w:rPr>
+        <w:t>SL_BALANCE</w:t>
+      </w:r>
+      <w:r>
+        <w:rPr>
+          <w:rFonts w:ascii="EEPAMF+Calibri-Bold"/>
+          <w:color w:val="000000"/>
+          <w:sz w:val="20"/>
+        </w:rPr>
+        <w:t>}</w:t>
+      </w:r>
+    </w:p>
+    <w:p>
+      <w:pPr>
+        <w:framePr w:w="2927" w:h="853" w:hRule="exact" w:wrap="auto" w:vAnchor="page" w:hAnchor="page" w:x="7270" w:y="13330"/>
+        <w:rPr>
+          <w:sz w:val="18"/>
+          <w:szCs w:val="18"/>
+        </w:rPr>
+      </w:pPr>
+      <w:r>
+        <w:rPr>
+          <w:sz w:val="18"/>
+          <w:szCs w:val="18"/>
+        </w:rPr>
+        <w:t>${</w:t>
+      </w:r>
+      <w:proofErr w:type="spellStart"/>
+      <w:r>
+        <w:rPr>
+          <w:sz w:val="18"/>
+          <w:szCs w:val="18"/>
+        </w:rPr>
+        <w:t>reco_disapprove</w:t>
+      </w:r>
+      <w:proofErr w:type="spellEnd"/>
+      <w:r>
+        <w:rPr>
+          <w:sz w:val="18"/>
+          <w:szCs w:val="18"/>
+        </w:rPr>
+        <w:t>}</w:t>
+      </w:r>
+    </w:p>
+    <w:p>
+      <w:pPr>
+        <w:framePr w:w="2927" w:h="853" w:hRule="exact" w:wrap="auto" w:vAnchor="page" w:hAnchor="page" w:x="7270" w:y="13330"/>
+        <w:widowControl w:val="0"/>
+        <w:autoSpaceDE w:val="0"/>
+        <w:autoSpaceDN w:val="0"/>
+        <w:adjustRightInd w:val="0"/>
+        <w:spacing w:before="0" w:after="0" w:line="190" w:lineRule="exact"/>
+        <w:jc w:val="left"/>
+        <w:rPr>
+          <w:rFonts w:ascii="VWDTOR+ArialMT"/>
+          <w:color w:val="000000"/>
+          <w:sz w:val="18"/>
+        </w:rPr>
+      </w:pPr>
+    </w:p>
+    <w:p>
+      <w:pPr>
+        <w:framePr w:w="1602" w:h="239" w:hRule="exact" w:wrap="auto" w:vAnchor="page" w:hAnchor="page" w:x="8457" w:y="11993"/>
+        <w:widowControl w:val="0"/>
+        <w:autoSpaceDE w:val="0"/>
+        <w:autoSpaceDN w:val="0"/>
+        <w:adjustRightInd w:val="0"/>
+        <w:spacing w:before="0" w:after="0" w:line="208" w:lineRule="exact"/>
+        <w:jc w:val="center"/>
+        <w:rPr>
+          <w:rFonts w:cs="Calibri"/>
+          <w:color w:val="000000"/>
+          <w:sz w:val="20"/>
+        </w:rPr>
+      </w:pPr>
+      <w:r>
+        <w:rPr>
+          <w:rFonts w:cs="Calibri"/>
+          <w:color w:val="000000"/>
+          <w:sz w:val="20"/>
+        </w:rPr>
+        <w:t>${SIGNAME}</w:t>
+      </w:r>
+    </w:p>
+    <w:p>
+      <w:pPr>
+        <w:framePr w:w="1479" w:wrap="auto" w:vAnchor="page" w:hAnchor="page" w:x="1404" w:y="9993"/>
+        <w:widowControl w:val="0"/>
+        <w:autoSpaceDE w:val="0"/>
+        <w:autoSpaceDN w:val="0"/>
+        <w:adjustRightInd w:val="0"/>
+        <w:spacing w:before="0" w:after="0" w:line="211" w:lineRule="exact"/>
+        <w:jc w:val="left"/>
+        <w:rPr>
+          <w:rFonts w:ascii="EEPAMF+Calibri-Bold"/>
+          <w:color w:val="000000"/>
+          <w:sz w:val="20"/>
+        </w:rPr>
+      </w:pPr>
+      <w:r>
+        <w:rPr>
+          <w:rFonts w:ascii="EEPAMF+Calibri-Bold"/>
+          <w:color w:val="000000"/>
+          <w:sz w:val="20"/>
+        </w:rPr>
+        <w:t>${</w:t>
+      </w:r>
+      <w:proofErr w:type="spellStart"/>
+      <w:r>
+        <w:rPr>
+          <w:rFonts w:ascii="EEPAMF+Calibri-Bold"/>
+          <w:color w:val="000000"/>
+          <w:sz w:val="20"/>
+        </w:rPr>
+        <w:t>type_others</w:t>
+      </w:r>
+      <w:proofErr w:type="spellEnd"/>
+      <w:r>
+        <w:rPr>
+          <w:rFonts w:ascii="EEPAMF+Calibri-Bold"/>
+          <w:color w:val="000000"/>
+          <w:sz w:val="20"/>
+        </w:rPr>
+        <w:t>}</w:t>
+      </w:r>
+    </w:p>
+    <w:p>
+      <w:pPr>
+        <w:framePr w:w="3807" w:h="412" w:hRule="exact" w:wrap="auto" w:vAnchor="page" w:hAnchor="page" w:x="7501" w:y="14875"/>
+        <w:widowControl w:val="0"/>
+        <w:autoSpaceDE w:val="0"/>
+        <w:autoSpaceDN w:val="0"/>
+        <w:adjustRightInd w:val="0"/>
+        <w:spacing w:before="0" w:after="0" w:line="190" w:lineRule="exact"/>
+        <w:jc w:val="center"/>
+        <w:rPr>
+          <w:rFonts w:ascii="IEVRAA+ArialMT"/>
+          <w:color w:val="000000"/>
+          <w:sz w:val="18"/>
+        </w:rPr>
+      </w:pPr>
+      <w:r>
+        <w:rPr>
+          <w:rFonts w:ascii="IEVRAA+ArialMT"/>
+          <w:color w:val="000000"/>
+          <w:sz w:val="18"/>
+        </w:rPr>
+        <w:t>$</w:t>
+      </w:r>
+      <w:r>
+        <w:rPr>
+          <w:rFonts w:ascii="IEVRAA+ArialMT"/>
+          <w:color w:val="000000"/>
+          <w:sz w:val="18"/>
+        </w:rPr>
+        <w:t>{RECOMMENDING_POSITION}</w:t>
+      </w:r>
+    </w:p>
+    <w:p>
+      <w:pPr>
         <w:rPr>
           <w:rFonts w:ascii="Arial"/>
           <w:sz w:val="2"/>
@@ -8488,386 +8974,220 @@
     </w:p>
     <w:p>
       <w:pPr>
-        <w:framePr w:w="4666" w:wrap="auto" w:vAnchor="page" w:hAnchor="page" w:x="830" w:y="11562"/>
+        <w:framePr w:w="4574" w:wrap="auto" w:vAnchor="page" w:hAnchor="page" w:x="7052" w:y="14510"/>
+        <w:widowControl w:val="0"/>
+        <w:autoSpaceDE w:val="0"/>
+        <w:autoSpaceDN w:val="0"/>
+        <w:adjustRightInd w:val="0"/>
+        <w:spacing w:before="26" w:after="0" w:line="211" w:lineRule="exact"/>
+        <w:jc w:val="center"/>
+        <w:rPr>
+          <w:color w:val="000000"/>
+          <w:sz w:val="20"/>
+        </w:rPr>
+      </w:pPr>
+      <w:r>
+        <w:rPr>
+          <w:rFonts w:ascii="EEPAMF+Calibri-Bold"/>
+          <w:color w:val="000000"/>
+          <w:sz w:val="20"/>
+        </w:rPr>
+        <w:t>${</w:t>
+      </w:r>
+      <w:r>
+        <w:rPr>
+          <w:rFonts w:ascii="EEPAMF+Calibri-Bold"/>
+          <w:color w:val="000000"/>
+          <w:sz w:val="20"/>
+        </w:rPr>
+        <w:t>RECOSIGN</w:t>
+      </w:r>
+      <w:r>
+        <w:rPr>
+          <w:rFonts w:ascii="EEPAMF+Calibri-Bold"/>
+          <w:color w:val="000000"/>
+          <w:sz w:val="20"/>
+        </w:rPr>
+        <w:t>}</w:t>
+      </w:r>
+    </w:p>
+    <w:p>
+      <w:pPr>
+        <w:framePr w:w="3807" w:h="412" w:hRule="exact" w:wrap="auto" w:vAnchor="page" w:hAnchor="page" w:x="1383" w:y="14551"/>
         <w:widowControl w:val="0"/>
         <w:autoSpaceDE w:val="0"/>
         <w:autoSpaceDN w:val="0"/>
         <w:adjustRightInd w:val="0"/>
         <w:spacing w:before="0" w:after="0" w:line="190" w:lineRule="exact"/>
-        <w:jc w:val="left"/>
-        <w:rPr>
-          <w:rFonts w:ascii="IEVRAA+ArialMT"/>
-          <w:color w:val="000000"/>
-          <w:sz w:val="18"/>
-        </w:rPr>
-      </w:pPr>
-      <w:r>
-        <w:rPr>
-          <w:rFonts w:ascii="IEVRAA+ArialMT"/>
-          <w:color w:val="000000"/>
-          <w:sz w:val="18"/>
-        </w:rPr>
-        <w:t>__________________________________</w:t>
-      </w:r>
-    </w:p>
-    <w:p>
-      <w:pPr>
-        <w:framePr w:w="1237" w:wrap="auto" w:vAnchor="page" w:hAnchor="page" w:x="3261" w:y="13613"/>
-        <w:widowControl w:val="0"/>
-        <w:autoSpaceDE w:val="0"/>
-        <w:autoSpaceDN w:val="0"/>
-        <w:adjustRightInd w:val="0"/>
-        <w:spacing w:before="0" w:after="0" w:line="211" w:lineRule="exact"/>
-        <w:jc w:val="left"/>
+        <w:jc w:val="center"/>
+        <w:rPr>
+          <w:rFonts w:ascii="IEVRAA+ArialMT"/>
+          <w:color w:val="000000"/>
+          <w:sz w:val="16"/>
+          <w:szCs w:val="16"/>
+        </w:rPr>
+      </w:pPr>
+      <w:r>
+        <w:rPr>
+          <w:rFonts w:ascii="IEVRAA+ArialMT"/>
+          <w:color w:val="000000"/>
+          <w:sz w:val="16"/>
+          <w:szCs w:val="16"/>
+        </w:rPr>
+        <w:t>${</w:t>
+      </w:r>
+      <w:proofErr w:type="spellStart"/>
+      <w:r>
+        <w:rPr>
+          <w:rFonts w:ascii="IEVRAA+ArialMT"/>
+          <w:color w:val="000000"/>
+          <w:sz w:val="16"/>
+          <w:szCs w:val="16"/>
+        </w:rPr>
+        <w:t>CertifyDate</w:t>
+      </w:r>
+      <w:proofErr w:type="spellEnd"/>
+      <w:r>
+        <w:rPr>
+          <w:rFonts w:ascii="IEVRAA+ArialMT"/>
+          <w:color w:val="000000"/>
+          <w:sz w:val="16"/>
+          <w:szCs w:val="16"/>
+        </w:rPr>
+        <w:t>}</w:t>
+      </w:r>
+    </w:p>
+    <w:p>
+      <w:pPr>
+        <w:framePr w:w="4574" w:wrap="auto" w:vAnchor="page" w:hAnchor="page" w:x="1107" w:y="14735"/>
+        <w:widowControl w:val="0"/>
+        <w:autoSpaceDE w:val="0"/>
+        <w:autoSpaceDN w:val="0"/>
+        <w:adjustRightInd w:val="0"/>
+        <w:spacing w:before="26" w:after="0" w:line="211" w:lineRule="exact"/>
+        <w:jc w:val="center"/>
+        <w:rPr>
+          <w:color w:val="000000"/>
+          <w:sz w:val="20"/>
+        </w:rPr>
+      </w:pPr>
+      <w:r>
         <w:rPr>
           <w:rFonts w:ascii="EEPAMF+Calibri-Bold"/>
           <w:color w:val="000000"/>
           <w:sz w:val="20"/>
         </w:rPr>
-      </w:pPr>
+        <w:t>${</w:t>
+      </w:r>
       <w:r>
         <w:rPr>
           <w:rFonts w:ascii="EEPAMF+Calibri-Bold"/>
           <w:color w:val="000000"/>
           <w:sz w:val="20"/>
         </w:rPr>
+        <w:t>HRSIGN</w:t>
+      </w:r>
+      <w:r>
+        <w:rPr>
+          <w:rFonts w:ascii="EEPAMF+Calibri-Bold"/>
+          <w:color w:val="000000"/>
+          <w:sz w:val="20"/>
+        </w:rPr>
+        <w:t>}</w:t>
+      </w:r>
+    </w:p>
+    <w:p>
+      <w:pPr>
+        <w:framePr w:w="3807" w:h="412" w:hRule="exact" w:wrap="auto" w:vAnchor="page" w:hAnchor="page" w:x="7374" w:y="14389"/>
+        <w:widowControl w:val="0"/>
+        <w:autoSpaceDE w:val="0"/>
+        <w:autoSpaceDN w:val="0"/>
+        <w:adjustRightInd w:val="0"/>
+        <w:spacing w:before="0" w:after="0" w:line="190" w:lineRule="exact"/>
+        <w:jc w:val="center"/>
+        <w:rPr>
+          <w:rFonts w:ascii="IEVRAA+ArialMT"/>
+          <w:color w:val="000000"/>
+          <w:sz w:val="16"/>
+          <w:szCs w:val="16"/>
+        </w:rPr>
+      </w:pPr>
+      <w:r>
+        <w:rPr>
+          <w:rFonts w:ascii="IEVRAA+ArialMT"/>
+          <w:color w:val="000000"/>
+          <w:sz w:val="16"/>
+          <w:szCs w:val="16"/>
+        </w:rPr>
         <w:t>${</w:t>
       </w:r>
-      <w:r>
-        <w:rPr>
-          <w:rFonts w:ascii="EEPAMF+Calibri-Bold"/>
-          <w:color w:val="000000"/>
-          <w:sz w:val="20"/>
-        </w:rPr>
-        <w:t>VL_CREDIT</w:t>
-      </w:r>
-      <w:r>
-        <w:rPr>
-          <w:rFonts w:ascii="EEPAMF+Calibri-Bold"/>
-          <w:color w:val="000000"/>
-          <w:sz w:val="20"/>
+      <w:proofErr w:type="spellStart"/>
+      <w:r>
+        <w:rPr>
+          <w:rFonts w:ascii="IEVRAA+ArialMT"/>
+          <w:color w:val="000000"/>
+          <w:sz w:val="16"/>
+          <w:szCs w:val="16"/>
+        </w:rPr>
+        <w:t>CertifyDate</w:t>
+      </w:r>
+      <w:proofErr w:type="spellEnd"/>
+      <w:r>
+        <w:rPr>
+          <w:rFonts w:ascii="IEVRAA+ArialMT"/>
+          <w:color w:val="000000"/>
+          <w:sz w:val="16"/>
+          <w:szCs w:val="16"/>
         </w:rPr>
         <w:t>}</w:t>
       </w:r>
     </w:p>
     <w:p>
       <w:pPr>
-        <w:framePr w:w="1685" w:wrap="auto" w:vAnchor="page" w:hAnchor="page" w:x="3262" w:y="13884"/>
-        <w:widowControl w:val="0"/>
-        <w:autoSpaceDE w:val="0"/>
-        <w:autoSpaceDN w:val="0"/>
-        <w:adjustRightInd w:val="0"/>
-        <w:spacing w:before="0" w:after="0" w:line="211" w:lineRule="exact"/>
-        <w:jc w:val="left"/>
-        <w:rPr>
-          <w:rFonts w:ascii="EEPAMF+Calibri-Bold"/>
-          <w:color w:val="000000"/>
-          <w:sz w:val="20"/>
-        </w:rPr>
-      </w:pPr>
-      <w:r>
-        <w:rPr>
-          <w:rFonts w:ascii="EEPAMF+Calibri-Bold"/>
-          <w:color w:val="000000"/>
-          <w:sz w:val="20"/>
-        </w:rPr>
-        <w:t>${</w:t>
-      </w:r>
-      <w:r>
-        <w:rPr>
-          <w:rFonts w:ascii="EEPAMF+Calibri-Bold"/>
-          <w:color w:val="000000"/>
-          <w:sz w:val="20"/>
-        </w:rPr>
-        <w:t>LESSVL</w:t>
-      </w:r>
-      <w:r>
-        <w:rPr>
-          <w:rFonts w:ascii="EEPAMF+Calibri-Bold"/>
-          <w:color w:val="000000"/>
-          <w:sz w:val="20"/>
-        </w:rPr>
-        <w:t>_CREDIT</w:t>
-      </w:r>
-      <w:r>
-        <w:rPr>
-          <w:rFonts w:ascii="EEPAMF+Calibri-Bold"/>
-          <w:color w:val="000000"/>
-          <w:sz w:val="20"/>
+        <w:framePr w:w="3807" w:h="266" w:hRule="exact" w:wrap="auto" w:vAnchor="page" w:hAnchor="page" w:x="1440" w:y="15011"/>
+        <w:widowControl w:val="0"/>
+        <w:autoSpaceDE w:val="0"/>
+        <w:autoSpaceDN w:val="0"/>
+        <w:adjustRightInd w:val="0"/>
+        <w:spacing w:before="0" w:after="0" w:line="190" w:lineRule="exact"/>
+        <w:jc w:val="center"/>
+        <w:rPr>
+          <w:rFonts w:ascii="IEVRAA+ArialMT"/>
+          <w:color w:val="000000"/>
+          <w:sz w:val="18"/>
+        </w:rPr>
+      </w:pPr>
+      <w:r>
+        <w:rPr>
+          <w:rFonts w:ascii="IEVRAA+ArialMT"/>
+          <w:color w:val="000000"/>
+          <w:sz w:val="18"/>
+        </w:rPr>
+        <w:t>$</w:t>
+      </w:r>
+      <w:r>
+        <w:rPr>
+          <w:rFonts w:ascii="IEVRAA+ArialMT"/>
+          <w:color w:val="000000"/>
+          <w:sz w:val="18"/>
+        </w:rPr>
+        <w:t>{</w:t>
+      </w:r>
+      <w:r>
+        <w:rPr>
+          <w:rFonts w:ascii="IEVRAA+ArialMT"/>
+          <w:color w:val="000000"/>
+          <w:sz w:val="18"/>
+        </w:rPr>
+        <w:t>VOLC_POS</w:t>
+      </w:r>
+      <w:r>
+        <w:rPr>
+          <w:rFonts w:ascii="IEVRAA+ArialMT"/>
+          <w:color w:val="000000"/>
+          <w:sz w:val="18"/>
         </w:rPr>
         <w:t>}</w:t>
-      </w:r>
-    </w:p>
-    <w:p>
-      <w:pPr>
-        <w:framePr w:w="1479" w:wrap="auto" w:vAnchor="page" w:hAnchor="page" w:x="3275" w:y="14156"/>
-        <w:widowControl w:val="0"/>
-        <w:autoSpaceDE w:val="0"/>
-        <w:autoSpaceDN w:val="0"/>
-        <w:adjustRightInd w:val="0"/>
-        <w:spacing w:before="0" w:after="0" w:line="211" w:lineRule="exact"/>
-        <w:jc w:val="left"/>
-        <w:rPr>
-          <w:rFonts w:ascii="EEPAMF+Calibri-Bold"/>
-          <w:color w:val="000000"/>
-          <w:sz w:val="20"/>
-        </w:rPr>
-      </w:pPr>
-      <w:r>
-        <w:rPr>
-          <w:rFonts w:ascii="EEPAMF+Calibri-Bold"/>
-          <w:color w:val="000000"/>
-          <w:sz w:val="20"/>
-        </w:rPr>
-        <w:t>${</w:t>
-      </w:r>
-      <w:r>
-        <w:rPr>
-          <w:rFonts w:ascii="EEPAMF+Calibri-Bold"/>
-          <w:color w:val="000000"/>
-          <w:sz w:val="20"/>
-        </w:rPr>
-        <w:t>V</w:t>
-      </w:r>
-      <w:r>
-        <w:rPr>
-          <w:rFonts w:ascii="EEPAMF+Calibri-Bold"/>
-          <w:color w:val="000000"/>
-          <w:sz w:val="20"/>
-        </w:rPr>
-        <w:t>L_</w:t>
-      </w:r>
-      <w:r>
-        <w:rPr>
-          <w:rFonts w:ascii="EEPAMF+Calibri-Bold"/>
-          <w:color w:val="000000"/>
-          <w:sz w:val="20"/>
-        </w:rPr>
-        <w:t>BALANCE</w:t>
-      </w:r>
-      <w:r>
-        <w:rPr>
-          <w:rFonts w:ascii="EEPAMF+Calibri-Bold"/>
-          <w:color w:val="000000"/>
-          <w:sz w:val="20"/>
-        </w:rPr>
-        <w:t>}</w:t>
-      </w:r>
-    </w:p>
-    <w:p>
-      <w:pPr>
-        <w:framePr w:w="1479" w:wrap="auto" w:vAnchor="page" w:hAnchor="page" w:x="4891" w:y="13599"/>
-        <w:widowControl w:val="0"/>
-        <w:autoSpaceDE w:val="0"/>
-        <w:autoSpaceDN w:val="0"/>
-        <w:adjustRightInd w:val="0"/>
-        <w:spacing w:before="0" w:after="0" w:line="211" w:lineRule="exact"/>
-        <w:jc w:val="left"/>
-        <w:rPr>
-          <w:rFonts w:ascii="EEPAMF+Calibri-Bold"/>
-          <w:color w:val="000000"/>
-          <w:sz w:val="20"/>
-        </w:rPr>
-      </w:pPr>
-      <w:r>
-        <w:rPr>
-          <w:rFonts w:ascii="EEPAMF+Calibri-Bold"/>
-          <w:color w:val="000000"/>
-          <w:sz w:val="20"/>
-        </w:rPr>
-        <w:t>${</w:t>
-      </w:r>
-      <w:r>
-        <w:rPr>
-          <w:rFonts w:ascii="EEPAMF+Calibri-Bold"/>
-          <w:color w:val="000000"/>
-          <w:sz w:val="20"/>
-        </w:rPr>
-        <w:t>SL</w:t>
-      </w:r>
-      <w:r>
-        <w:rPr>
-          <w:rFonts w:ascii="EEPAMF+Calibri-Bold"/>
-          <w:color w:val="000000"/>
-          <w:sz w:val="20"/>
-        </w:rPr>
-        <w:t>_</w:t>
-      </w:r>
-      <w:r>
-        <w:rPr>
-          <w:rFonts w:ascii="EEPAMF+Calibri-Bold" w:cs="IEVRAA+ArialMT"/>
-          <w:color w:val="000000"/>
-          <w:sz w:val="20"/>
-        </w:rPr>
-        <w:t>CREDIT</w:t>
-      </w:r>
-      <w:r>
-        <w:rPr>
-          <w:rFonts w:ascii="EEPAMF+Calibri-Bold"/>
-          <w:color w:val="000000"/>
-          <w:sz w:val="20"/>
-        </w:rPr>
-        <w:t>}</w:t>
-      </w:r>
-    </w:p>
-    <w:p>
-      <w:pPr>
-        <w:framePr w:w="2609" w:wrap="auto" w:vAnchor="page" w:hAnchor="page" w:x="4892" w:y="13858"/>
-        <w:widowControl w:val="0"/>
-        <w:autoSpaceDE w:val="0"/>
-        <w:autoSpaceDN w:val="0"/>
-        <w:adjustRightInd w:val="0"/>
-        <w:spacing w:before="0" w:after="0" w:line="211" w:lineRule="exact"/>
-        <w:jc w:val="left"/>
-        <w:rPr>
-          <w:rFonts w:ascii="EEPAMF+Calibri-Bold" w:cs="IEVRAA+ArialMT"/>
-          <w:color w:val="000000"/>
-          <w:sz w:val="20"/>
-        </w:rPr>
-      </w:pPr>
-      <w:r>
-        <w:rPr>
-          <w:rFonts w:ascii="EEPAMF+Calibri-Bold" w:cs="IEVRAA+ArialMT"/>
-          <w:color w:val="000000"/>
-          <w:sz w:val="20"/>
-        </w:rPr>
-        <w:t>${LESS</w:t>
-      </w:r>
-      <w:r>
-        <w:rPr>
-          <w:rFonts w:ascii="EEPAMF+Calibri-Bold" w:cs="IEVRAA+ArialMT"/>
-          <w:color w:val="000000"/>
-          <w:sz w:val="20"/>
-        </w:rPr>
-        <w:t>S</w:t>
-      </w:r>
-      <w:r>
-        <w:rPr>
-          <w:rFonts w:ascii="EEPAMF+Calibri-Bold" w:cs="IEVRAA+ArialMT"/>
-          <w:color w:val="000000"/>
-          <w:sz w:val="20"/>
-        </w:rPr>
-        <w:t>L_CREDIT}</w:t>
-      </w:r>
-    </w:p>
-    <w:p>
-      <w:pPr>
-        <w:framePr w:w="1479" w:wrap="auto" w:vAnchor="page" w:hAnchor="page" w:x="4891" w:y="14143"/>
-        <w:widowControl w:val="0"/>
-        <w:autoSpaceDE w:val="0"/>
-        <w:autoSpaceDN w:val="0"/>
-        <w:adjustRightInd w:val="0"/>
-        <w:spacing w:before="0" w:after="0" w:line="211" w:lineRule="exact"/>
-        <w:jc w:val="left"/>
-        <w:rPr>
-          <w:rFonts w:ascii="EEPAMF+Calibri-Bold"/>
-          <w:color w:val="000000"/>
-          <w:sz w:val="20"/>
-        </w:rPr>
-      </w:pPr>
-      <w:r>
-        <w:rPr>
-          <w:rFonts w:ascii="EEPAMF+Calibri-Bold"/>
-          <w:color w:val="000000"/>
-          <w:sz w:val="20"/>
-        </w:rPr>
-        <w:t>${</w:t>
-      </w:r>
-      <w:r>
-        <w:rPr>
-          <w:rFonts w:ascii="EEPAMF+Calibri-Bold"/>
-          <w:color w:val="000000"/>
-          <w:sz w:val="20"/>
-        </w:rPr>
-        <w:t>SL_</w:t>
-      </w:r>
-      <w:r>
-        <w:rPr>
-          <w:rFonts w:ascii="EEPAMF+Calibri-Bold"/>
-          <w:color w:val="000000"/>
-          <w:sz w:val="20"/>
-        </w:rPr>
-        <w:t>BALANCE</w:t>
-      </w:r>
-      <w:r>
-        <w:rPr>
-          <w:rFonts w:ascii="EEPAMF+Calibri-Bold"/>
-          <w:color w:val="000000"/>
-          <w:sz w:val="20"/>
-        </w:rPr>
-        <w:t>}</w:t>
-      </w:r>
-    </w:p>
-    <w:p>
-      <w:pPr>
-        <w:framePr w:w="2927" w:h="853" w:hRule="exact" w:wrap="auto" w:vAnchor="page" w:hAnchor="page" w:x="7270" w:y="13330"/>
-        <w:rPr>
-          <w:sz w:val="18"/>
-          <w:szCs w:val="18"/>
-        </w:rPr>
-      </w:pPr>
-      <w:r>
-        <w:rPr>
-          <w:sz w:val="18"/>
-          <w:szCs w:val="18"/>
-        </w:rPr>
-        <w:t>${</w:t>
-      </w:r>
-      <w:proofErr w:type="spellStart"/>
-      <w:r>
-        <w:rPr>
-          <w:sz w:val="18"/>
-          <w:szCs w:val="18"/>
-        </w:rPr>
-        <w:t>reco_disapprove</w:t>
-      </w:r>
-      <w:proofErr w:type="spellEnd"/>
-      <w:r>
-        <w:rPr>
-          <w:sz w:val="18"/>
-          <w:szCs w:val="18"/>
-        </w:rPr>
-        <w:t>}</w:t>
-      </w:r>
-    </w:p>
-    <w:p>
-      <w:pPr>
-        <w:framePr w:w="2927" w:h="853" w:hRule="exact" w:wrap="auto" w:vAnchor="page" w:hAnchor="page" w:x="7270" w:y="13330"/>
-        <w:widowControl w:val="0"/>
-        <w:autoSpaceDE w:val="0"/>
-        <w:autoSpaceDN w:val="0"/>
-        <w:adjustRightInd w:val="0"/>
-        <w:spacing w:before="0" w:after="0" w:line="190" w:lineRule="exact"/>
-        <w:jc w:val="left"/>
-        <w:rPr>
-          <w:rFonts w:ascii="VWDTOR+ArialMT"/>
-          <w:color w:val="000000"/>
-          <w:sz w:val="18"/>
-        </w:rPr>
-      </w:pPr>
-    </w:p>
-    <w:p>
-      <w:pPr>
-        <w:framePr w:w="1602" w:h="239" w:hRule="exact" w:wrap="auto" w:vAnchor="page" w:hAnchor="page" w:x="8457" w:y="11993"/>
-        <w:widowControl w:val="0"/>
-        <w:autoSpaceDE w:val="0"/>
-        <w:autoSpaceDN w:val="0"/>
-        <w:adjustRightInd w:val="0"/>
-        <w:spacing w:before="0" w:after="0" w:line="208" w:lineRule="exact"/>
-        <w:jc w:val="center"/>
-        <w:rPr>
-          <w:rFonts w:cs="Calibri"/>
-          <w:color w:val="000000"/>
-          <w:sz w:val="20"/>
-        </w:rPr>
-      </w:pPr>
-      <w:r>
-        <w:rPr>
-          <w:rFonts w:cs="Calibri"/>
-          <w:color w:val="000000"/>
-          <w:sz w:val="20"/>
-        </w:rPr>
-        <w:t>${SIGNAME}</w:t>
       </w:r>
     </w:p>
     <w:p>
@@ -8880,6 +9200,54 @@
     </w:p>
     <w:p>
       <w:pPr>
+        <w:framePr w:w="2939" w:h="876" w:hRule="exact" w:wrap="auto" w:vAnchor="page" w:hAnchor="page" w:x="7178" w:y="15460"/>
+        <w:rPr>
+          <w:sz w:val="18"/>
+          <w:szCs w:val="18"/>
+        </w:rPr>
+      </w:pPr>
+      <w:r>
+        <w:rPr>
+          <w:sz w:val="18"/>
+          <w:szCs w:val="18"/>
+        </w:rPr>
+        <w:t>${</w:t>
+      </w:r>
+      <w:proofErr w:type="spellStart"/>
+      <w:r>
+        <w:rPr>
+          <w:sz w:val="18"/>
+          <w:szCs w:val="18"/>
+        </w:rPr>
+        <w:t>appro_disapprove</w:t>
+      </w:r>
+      <w:proofErr w:type="spellEnd"/>
+      <w:r>
+        <w:rPr>
+          <w:sz w:val="18"/>
+          <w:szCs w:val="18"/>
+        </w:rPr>
+        <w:t>}</w:t>
+      </w:r>
+    </w:p>
+    <w:p>
+      <w:pPr>
+        <w:framePr w:w="2939" w:h="876" w:hRule="exact" w:wrap="auto" w:vAnchor="page" w:hAnchor="page" w:x="7178" w:y="15460"/>
+        <w:widowControl w:val="0"/>
+        <w:autoSpaceDE w:val="0"/>
+        <w:autoSpaceDN w:val="0"/>
+        <w:adjustRightInd w:val="0"/>
+        <w:spacing w:before="0" w:after="0" w:line="190" w:lineRule="exact"/>
+        <w:jc w:val="left"/>
+        <w:rPr>
+          <w:rFonts w:ascii="VWDTOR+ArialMT"/>
+          <w:color w:val="000000"/>
+          <w:sz w:val="18"/>
+        </w:rPr>
+      </w:pPr>
+    </w:p>
+    <w:p>
+      <w:pPr>
         <w:rPr>
           <w:rFonts w:ascii="Arial"/>
           <w:sz w:val="2"/>
@@ -8888,39 +9256,100 @@
     </w:p>
     <w:p>
       <w:pPr>
-        <w:framePr w:w="4574" w:wrap="auto" w:vAnchor="page" w:hAnchor="page" w:x="7052" w:y="14510"/>
-        <w:widowControl w:val="0"/>
-        <w:autoSpaceDE w:val="0"/>
-        <w:autoSpaceDN w:val="0"/>
-        <w:adjustRightInd w:val="0"/>
-        <w:spacing w:before="26" w:after="0" w:line="211" w:lineRule="exact"/>
-        <w:jc w:val="center"/>
-        <w:rPr>
-          <w:color w:val="000000"/>
-          <w:sz w:val="20"/>
-        </w:rPr>
-      </w:pPr>
-      <w:r>
-        <w:rPr>
-          <w:rFonts w:ascii="EEPAMF+Calibri-Bold"/>
-          <w:color w:val="000000"/>
-          <w:sz w:val="20"/>
+        <w:framePr w:w="1862" w:wrap="auto" w:vAnchor="page" w:hAnchor="page" w:x="1153" w:y="15599"/>
+        <w:widowControl w:val="0"/>
+        <w:autoSpaceDE w:val="0"/>
+        <w:autoSpaceDN w:val="0"/>
+        <w:adjustRightInd w:val="0"/>
+        <w:spacing w:before="0" w:after="0" w:line="201" w:lineRule="exact"/>
+        <w:jc w:val="left"/>
+        <w:rPr>
+          <w:rFonts w:cs="Calibri"/>
+          <w:color w:val="000000"/>
+          <w:sz w:val="19"/>
+        </w:rPr>
+      </w:pPr>
+      <w:r>
+        <w:rPr>
+          <w:rFonts w:cs="Calibri"/>
+          <w:color w:val="000000"/>
+          <w:sz w:val="19"/>
         </w:rPr>
         <w:t>${</w:t>
       </w:r>
       <w:r>
         <w:rPr>
-          <w:rFonts w:ascii="EEPAMF+Calibri-Bold"/>
-          <w:color w:val="000000"/>
-          <w:sz w:val="20"/>
-        </w:rPr>
-        <w:t>RECOSIGN</w:t>
-      </w:r>
-      <w:r>
-        <w:rPr>
-          <w:rFonts w:ascii="EEPAMF+Calibri-Bold"/>
-          <w:color w:val="000000"/>
-          <w:sz w:val="20"/>
+          <w:rFonts w:cs="Calibri"/>
+          <w:color w:val="000000"/>
+          <w:sz w:val="16"/>
+          <w:szCs w:val="16"/>
+        </w:rPr>
+        <w:t>DAYWPAY</w:t>
+      </w:r>
+      <w:r>
+        <w:rPr>
+          <w:rFonts w:cs="Calibri"/>
+          <w:color w:val="000000"/>
+          <w:sz w:val="19"/>
+        </w:rPr>
+        <w:t>}</w:t>
+      </w:r>
+    </w:p>
+    <w:p>
+      <w:pPr>
+        <w:framePr w:w="1862" w:wrap="auto" w:vAnchor="page" w:hAnchor="page" w:x="1153" w:y="15841"/>
+        <w:widowControl w:val="0"/>
+        <w:autoSpaceDE w:val="0"/>
+        <w:autoSpaceDN w:val="0"/>
+        <w:adjustRightInd w:val="0"/>
+        <w:spacing w:before="0" w:after="0" w:line="201" w:lineRule="exact"/>
+        <w:jc w:val="left"/>
+        <w:rPr>
+          <w:rFonts w:cs="Calibri"/>
+          <w:color w:val="000000"/>
+          <w:sz w:val="19"/>
+        </w:rPr>
+      </w:pPr>
+      <w:r>
+        <w:rPr>
+          <w:rFonts w:cs="Calibri"/>
+          <w:color w:val="000000"/>
+          <w:sz w:val="19"/>
+        </w:rPr>
+        <w:t>${</w:t>
+      </w:r>
+      <w:r>
+        <w:rPr>
+          <w:rFonts w:cs="Calibri"/>
+          <w:color w:val="000000"/>
+          <w:sz w:val="16"/>
+          <w:szCs w:val="16"/>
+        </w:rPr>
+        <w:t>DAYW</w:t>
+      </w:r>
+      <w:r>
+        <w:rPr>
+          <w:rFonts w:cs="Calibri"/>
+          <w:color w:val="000000"/>
+          <w:sz w:val="16"/>
+          <w:szCs w:val="16"/>
+        </w:rPr>
+        <w:t>O</w:t>
+      </w:r>
+      <w:r>
+        <w:rPr>
+          <w:rFonts w:cs="Calibri"/>
+          <w:color w:val="000000"/>
+          <w:sz w:val="16"/>
+          <w:szCs w:val="16"/>
+        </w:rPr>
+        <w:t>PAY</w:t>
+      </w:r>
+      <w:r>
+        <w:rPr>
+          <w:rFonts w:cs="Calibri"/>
+          <w:color w:val="000000"/>
+          <w:sz w:val="19"/>
         </w:rPr>
         <w:t>}</w:t>
       </w:r>
@@ -8935,100 +9364,44 @@
     </w:p>
     <w:p>
       <w:pPr>
-        <w:framePr w:w="1479" w:wrap="auto" w:vAnchor="page" w:hAnchor="page" w:x="1404" w:y="9993"/>
-        <w:widowControl w:val="0"/>
-        <w:autoSpaceDE w:val="0"/>
-        <w:autoSpaceDN w:val="0"/>
-        <w:adjustRightInd w:val="0"/>
-        <w:spacing w:before="0" w:after="0" w:line="211" w:lineRule="exact"/>
-        <w:jc w:val="left"/>
-        <w:rPr>
-          <w:rFonts w:ascii="EEPAMF+Calibri-Bold"/>
-          <w:color w:val="000000"/>
-          <w:sz w:val="20"/>
-        </w:rPr>
-      </w:pPr>
-      <w:r>
-        <w:rPr>
-          <w:rFonts w:ascii="EEPAMF+Calibri-Bold"/>
-          <w:color w:val="000000"/>
-          <w:sz w:val="20"/>
+        <w:framePr w:w="1862" w:wrap="auto" w:vAnchor="page" w:hAnchor="page" w:x="1142" w:y="16083"/>
+        <w:widowControl w:val="0"/>
+        <w:autoSpaceDE w:val="0"/>
+        <w:autoSpaceDN w:val="0"/>
+        <w:adjustRightInd w:val="0"/>
+        <w:spacing w:before="0" w:after="0" w:line="201" w:lineRule="exact"/>
+        <w:jc w:val="left"/>
+        <w:rPr>
+          <w:rFonts w:cs="Calibri"/>
+          <w:color w:val="000000"/>
+          <w:sz w:val="19"/>
+        </w:rPr>
+      </w:pPr>
+      <w:r>
+        <w:rPr>
+          <w:rFonts w:cs="Calibri"/>
+          <w:color w:val="000000"/>
+          <w:sz w:val="19"/>
         </w:rPr>
         <w:t>${</w:t>
       </w:r>
-      <w:proofErr w:type="spellStart"/>
-      <w:r>
-        <w:rPr>
-          <w:rFonts w:ascii="EEPAMF+Calibri-Bold"/>
-          <w:color w:val="000000"/>
-          <w:sz w:val="20"/>
-        </w:rPr>
-        <w:t>type_others</w:t>
-      </w:r>
-      <w:proofErr w:type="spellEnd"/>
-      <w:r>
-        <w:rPr>
-          <w:rFonts w:ascii="EEPAMF+Calibri-Bold"/>
-          <w:color w:val="000000"/>
-          <w:sz w:val="20"/>
+      <w:r>
+        <w:rPr>
+          <w:rFonts w:cs="Calibri"/>
+          <w:color w:val="000000"/>
+          <w:sz w:val="16"/>
+          <w:szCs w:val="16"/>
+        </w:rPr>
+        <w:t>OTHERS</w:t>
+      </w:r>
+      <w:r>
+        <w:rPr>
+          <w:rFonts w:cs="Calibri"/>
+          <w:color w:val="000000"/>
+          <w:sz w:val="19"/>
         </w:rPr>
         <w:t>}</w:t>
       </w:r>
-    </w:p>
-    <w:p>
-      <w:pPr>
-        <w:framePr w:w="2939" w:h="876" w:hRule="exact" w:wrap="auto" w:vAnchor="page" w:hAnchor="page" w:x="7178" w:y="15460"/>
-        <w:rPr>
-          <w:sz w:val="18"/>
-          <w:szCs w:val="18"/>
-        </w:rPr>
-      </w:pPr>
-      <w:r>
-        <w:rPr>
-          <w:sz w:val="18"/>
-          <w:szCs w:val="18"/>
-        </w:rPr>
-        <w:t>${</w:t>
-      </w:r>
-      <w:proofErr w:type="spellStart"/>
-      <w:r>
-        <w:rPr>
-          <w:sz w:val="18"/>
-          <w:szCs w:val="18"/>
-        </w:rPr>
-        <w:t>appro</w:t>
-      </w:r>
-      <w:r>
-        <w:rPr>
-          <w:sz w:val="18"/>
-          <w:szCs w:val="18"/>
-        </w:rPr>
-        <w:t>_disapprove</w:t>
-      </w:r>
-      <w:proofErr w:type="spellEnd"/>
-      <w:r>
-        <w:rPr>
-          <w:sz w:val="18"/>
-          <w:szCs w:val="18"/>
-        </w:rPr>
-        <w:t>}</w:t>
-      </w:r>
-    </w:p>
-    <w:p>
-      <w:pPr>
-        <w:framePr w:w="2939" w:h="876" w:hRule="exact" w:wrap="auto" w:vAnchor="page" w:hAnchor="page" w:x="7178" w:y="15460"/>
-        <w:widowControl w:val="0"/>
-        <w:autoSpaceDE w:val="0"/>
-        <w:autoSpaceDN w:val="0"/>
-        <w:adjustRightInd w:val="0"/>
-        <w:spacing w:before="0" w:after="0" w:line="190" w:lineRule="exact"/>
-        <w:jc w:val="left"/>
-        <w:rPr>
-          <w:rFonts w:ascii="VWDTOR+ArialMT"/>
-          <w:color w:val="000000"/>
-          <w:sz w:val="18"/>
-        </w:rPr>
-      </w:pPr>
     </w:p>
     <w:p>
       <w:pPr>
@@ -9040,110 +9413,34 @@
     </w:p>
     <w:p>
       <w:pPr>
-        <w:framePr w:w="1862" w:wrap="auto" w:vAnchor="page" w:hAnchor="page" w:x="1153" w:y="15599"/>
-        <w:widowControl w:val="0"/>
-        <w:autoSpaceDE w:val="0"/>
-        <w:autoSpaceDN w:val="0"/>
-        <w:adjustRightInd w:val="0"/>
-        <w:spacing w:before="0" w:after="0" w:line="201" w:lineRule="exact"/>
-        <w:jc w:val="left"/>
-        <w:rPr>
-          <w:rFonts w:cs="Calibri"/>
-          <w:color w:val="000000"/>
-          <w:sz w:val="19"/>
-        </w:rPr>
-      </w:pPr>
-      <w:r>
-        <w:rPr>
-          <w:rFonts w:cs="Calibri"/>
-          <w:color w:val="000000"/>
-          <w:sz w:val="19"/>
+        <w:framePr w:w="1523" w:wrap="auto" w:vAnchor="page" w:hAnchor="page" w:x="1542" w:y="10794"/>
+        <w:widowControl w:val="0"/>
+        <w:autoSpaceDE w:val="0"/>
+        <w:autoSpaceDN w:val="0"/>
+        <w:adjustRightInd w:val="0"/>
+        <w:spacing w:before="0" w:after="0" w:line="211" w:lineRule="exact"/>
+        <w:jc w:val="left"/>
+        <w:rPr>
+          <w:rFonts w:ascii="EEPAMF+Calibri-Bold"/>
+          <w:color w:val="000000"/>
+          <w:sz w:val="20"/>
+        </w:rPr>
+      </w:pPr>
+      <w:r>
+        <w:rPr>
+          <w:rFonts w:ascii="EEPAMF+Calibri-Bold"/>
+          <w:color w:val="000000"/>
+          <w:sz w:val="20"/>
         </w:rPr>
         <w:t>$</w:t>
       </w:r>
       <w:r>
         <w:rPr>
-          <w:rFonts w:cs="Calibri"/>
-          <w:color w:val="000000"/>
-          <w:sz w:val="19"/>
-        </w:rPr>
-        <w:t>{</w:t>
-      </w:r>
-      <w:r>
-        <w:rPr>
-          <w:rFonts w:cs="Calibri"/>
-          <w:color w:val="000000"/>
-          <w:sz w:val="16"/>
-          <w:szCs w:val="16"/>
-        </w:rPr>
-        <w:t>DAYWPAY</w:t>
-      </w:r>
-      <w:r>
-        <w:rPr>
-          <w:rFonts w:cs="Calibri"/>
-          <w:color w:val="000000"/>
-          <w:sz w:val="19"/>
-        </w:rPr>
-        <w:t>}</w:t>
-      </w:r>
-    </w:p>
-    <w:p>
-      <w:pPr>
-        <w:framePr w:w="1862" w:wrap="auto" w:vAnchor="page" w:hAnchor="page" w:x="1153" w:y="15841"/>
-        <w:widowControl w:val="0"/>
-        <w:autoSpaceDE w:val="0"/>
-        <w:autoSpaceDN w:val="0"/>
-        <w:adjustRightInd w:val="0"/>
-        <w:spacing w:before="0" w:after="0" w:line="201" w:lineRule="exact"/>
-        <w:jc w:val="left"/>
-        <w:rPr>
-          <w:rFonts w:cs="Calibri"/>
-          <w:color w:val="000000"/>
-          <w:sz w:val="19"/>
-        </w:rPr>
-      </w:pPr>
-      <w:r>
-        <w:rPr>
-          <w:rFonts w:cs="Calibri"/>
-          <w:color w:val="000000"/>
-          <w:sz w:val="19"/>
-        </w:rPr>
-        <w:t>${</w:t>
-      </w:r>
-      <w:r>
-        <w:rPr>
-          <w:rFonts w:cs="Calibri"/>
-          <w:color w:val="000000"/>
-          <w:sz w:val="16"/>
-          <w:szCs w:val="16"/>
-        </w:rPr>
-        <w:t>DAYW</w:t>
-      </w:r>
-      <w:r>
-        <w:rPr>
-          <w:rFonts w:cs="Calibri"/>
-          <w:color w:val="000000"/>
-          <w:sz w:val="16"/>
-          <w:szCs w:val="16"/>
-        </w:rPr>
-        <w:t>O</w:t>
-      </w:r>
-      <w:r>
-        <w:rPr>
-          <w:rFonts w:cs="Calibri"/>
-          <w:color w:val="000000"/>
-          <w:sz w:val="16"/>
-          <w:szCs w:val="16"/>
-        </w:rPr>
-        <w:t>PAY</w:t>
-      </w:r>
-      <w:r>
-        <w:rPr>
-          <w:rFonts w:cs="Calibri"/>
-          <w:color w:val="000000"/>
-          <w:sz w:val="19"/>
-        </w:rPr>
-        <w:t>}</w:t>
+          <w:rFonts w:ascii="EEPAMF+Calibri-Bold"/>
+          <w:color w:val="000000"/>
+          <w:sz w:val="20"/>
+        </w:rPr>
+        <w:t>{day}</w:t>
       </w:r>
     </w:p>
     <w:p>
@@ -9156,47 +9453,6 @@
     </w:p>
     <w:p>
       <w:pPr>
-        <w:framePr w:w="1862" w:wrap="auto" w:vAnchor="page" w:hAnchor="page" w:x="1142" w:y="16083"/>
-        <w:widowControl w:val="0"/>
-        <w:autoSpaceDE w:val="0"/>
-        <w:autoSpaceDN w:val="0"/>
-        <w:adjustRightInd w:val="0"/>
-        <w:spacing w:before="0" w:after="0" w:line="201" w:lineRule="exact"/>
-        <w:jc w:val="left"/>
-        <w:rPr>
-          <w:rFonts w:cs="Calibri"/>
-          <w:color w:val="000000"/>
-          <w:sz w:val="19"/>
-        </w:rPr>
-      </w:pPr>
-      <w:r>
-        <w:rPr>
-          <w:rFonts w:cs="Calibri"/>
-          <w:color w:val="000000"/>
-          <w:sz w:val="19"/>
-        </w:rPr>
-        <w:t>${</w:t>
-      </w:r>
-      <w:r>
-        <w:rPr>
-          <w:rFonts w:cs="Calibri"/>
-          <w:color w:val="000000"/>
-          <w:sz w:val="16"/>
-          <w:szCs w:val="16"/>
-        </w:rPr>
-        <w:t>OTHERS</w:t>
-      </w:r>
-      <w:r>
-        <w:rPr>
-          <w:rFonts w:cs="Calibri"/>
-          <w:color w:val="000000"/>
-          <w:sz w:val="19"/>
-        </w:rPr>
-        <w:t>}</w:t>
-      </w:r>
-    </w:p>
-    <w:p>
-      <w:pPr>
         <w:rPr>
           <w:rFonts w:ascii="Arial"/>
           <w:sz w:val="2"/>
@@ -9205,55 +9461,7 @@
     </w:p>
     <w:p>
       <w:pPr>
-        <w:framePr w:w="1523" w:wrap="auto" w:vAnchor="page" w:hAnchor="page" w:x="1542" w:y="10794"/>
-        <w:widowControl w:val="0"/>
-        <w:autoSpaceDE w:val="0"/>
-        <w:autoSpaceDN w:val="0"/>
-        <w:adjustRightInd w:val="0"/>
-        <w:spacing w:before="0" w:after="0" w:line="211" w:lineRule="exact"/>
-        <w:jc w:val="left"/>
-        <w:rPr>
-          <w:rFonts w:ascii="EEPAMF+Calibri-Bold"/>
-          <w:color w:val="000000"/>
-          <w:sz w:val="20"/>
-        </w:rPr>
-      </w:pPr>
-      <w:r>
-        <w:rPr>
-          <w:rFonts w:ascii="EEPAMF+Calibri-Bold"/>
-          <w:color w:val="000000"/>
-          <w:sz w:val="20"/>
-        </w:rPr>
-        <w:t>$</w:t>
-      </w:r>
-      <w:r>
-        <w:rPr>
-          <w:rFonts w:ascii="EEPAMF+Calibri-Bold"/>
-          <w:color w:val="000000"/>
-          <w:sz w:val="20"/>
-        </w:rPr>
-        <w:t>{day}</w:t>
-      </w:r>
-    </w:p>
-    <w:p>
-      <w:pPr>
-        <w:rPr>
-          <w:rFonts w:ascii="Arial"/>
-          <w:sz w:val="2"/>
-        </w:rPr>
-      </w:pPr>
-    </w:p>
-    <w:p>
-      <w:pPr>
-        <w:rPr>
-          <w:rFonts w:ascii="Arial"/>
-          <w:sz w:val="2"/>
-        </w:rPr>
-      </w:pPr>
-    </w:p>
-    <w:p>
-      <w:pPr>
-        <w:framePr w:w="3256" w:wrap="auto" w:vAnchor="page" w:hAnchor="page" w:x="890" w:y="11459"/>
+        <w:framePr w:w="5266" w:wrap="auto" w:vAnchor="page" w:hAnchor="page" w:x="890" w:y="11459"/>
         <w:widowControl w:val="0"/>
         <w:autoSpaceDE w:val="0"/>
         <w:autoSpaceDN w:val="0"/>
@@ -9650,38 +9858,6 @@
     </w:p>
     <w:p>
       <w:pPr>
-        <w:framePr w:w="3807" w:h="412" w:hRule="exact" w:wrap="auto" w:vAnchor="page" w:hAnchor="page" w:x="7501" w:y="14875"/>
-        <w:widowControl w:val="0"/>
-        <w:autoSpaceDE w:val="0"/>
-        <w:autoSpaceDN w:val="0"/>
-        <w:adjustRightInd w:val="0"/>
-        <w:spacing w:before="0" w:after="0" w:line="190" w:lineRule="exact"/>
-        <w:jc w:val="center"/>
-        <w:rPr>
-          <w:rFonts w:ascii="IEVRAA+ArialMT"/>
-          <w:color w:val="000000"/>
-          <w:sz w:val="18"/>
-        </w:rPr>
-      </w:pPr>
-      <w:r>
-        <w:rPr>
-          <w:rFonts w:ascii="IEVRAA+ArialMT"/>
-          <w:color w:val="000000"/>
-          <w:sz w:val="18"/>
-        </w:rPr>
-        <w:t>$</w:t>
-      </w:r>
-      <w:r>
-        <w:rPr>
-          <w:rFonts w:ascii="IEVRAA+ArialMT"/>
-          <w:color w:val="000000"/>
-          <w:sz w:val="18"/>
-        </w:rPr>
-        <w:t>{RECOMMENDING_POSITION}</w:t>
-      </w:r>
-    </w:p>
-    <w:p>
-      <w:pPr>
         <w:framePr w:w="4040" w:wrap="auto" w:vAnchor="page" w:hAnchor="page" w:x="7351" w:y="14572"/>
         <w:widowControl w:val="0"/>
         <w:autoSpaceDE w:val="0"/>
@@ -9728,7 +9904,6 @@
           <w:color w:val="000000"/>
           <w:sz w:val="18"/>
         </w:rPr>
-        <w:lastRenderedPageBreak/>
         <w:t>__________________________________</w:t>
       </w:r>
       <w:r>
@@ -9769,68 +9944,6 @@
     </w:p>
     <w:p>
       <w:pPr>
-        <w:framePr w:w="4574" w:wrap="auto" w:vAnchor="page" w:hAnchor="page" w:x="956" w:y="14987"/>
-        <w:widowControl w:val="0"/>
-        <w:autoSpaceDE w:val="0"/>
-        <w:autoSpaceDN w:val="0"/>
-        <w:adjustRightInd w:val="0"/>
-        <w:spacing w:before="26" w:after="0" w:line="211" w:lineRule="exact"/>
-        <w:jc w:val="center"/>
-        <w:rPr>
-          <w:color w:val="000000"/>
-          <w:sz w:val="20"/>
-        </w:rPr>
-      </w:pPr>
-      <w:r>
-        <w:rPr>
-          <w:rFonts w:ascii="EEPAMF+Calibri-Bold"/>
-          <w:color w:val="000000"/>
-          <w:sz w:val="20"/>
-        </w:rPr>
-        <w:t>${VOLC_POS}</w:t>
-      </w:r>
-    </w:p>
-    <w:p>
-      <w:pPr>
-        <w:framePr w:w="4574" w:wrap="auto" w:vAnchor="page" w:hAnchor="page" w:x="1056" w:y="14484"/>
-        <w:widowControl w:val="0"/>
-        <w:autoSpaceDE w:val="0"/>
-        <w:autoSpaceDN w:val="0"/>
-        <w:adjustRightInd w:val="0"/>
-        <w:spacing w:before="26" w:after="0" w:line="211" w:lineRule="exact"/>
-        <w:jc w:val="center"/>
-        <w:rPr>
-          <w:color w:val="000000"/>
-          <w:sz w:val="20"/>
-        </w:rPr>
-      </w:pPr>
-      <w:r>
-        <w:rPr>
-          <w:rFonts w:ascii="EEPAMF+Calibri-Bold"/>
-          <w:color w:val="000000"/>
-          <w:sz w:val="20"/>
-        </w:rPr>
-        <w:t>${</w:t>
-      </w:r>
-      <w:r>
-        <w:rPr>
-          <w:rFonts w:ascii="EEPAMF+Calibri-Bold"/>
-          <w:color w:val="000000"/>
-          <w:sz w:val="20"/>
-        </w:rPr>
-        <w:t>HRSIGN</w:t>
-      </w:r>
-      <w:r>
-        <w:rPr>
-          <w:rFonts w:ascii="EEPAMF+Calibri-Bold"/>
-          <w:color w:val="000000"/>
-          <w:sz w:val="20"/>
-        </w:rPr>
-        <w:t>}</w:t>
-      </w:r>
-    </w:p>
-    <w:p>
-      <w:pPr>
         <w:rPr>
           <w:rFonts w:ascii="Arial"/>
           <w:sz w:val="2"/>
@@ -9858,6 +9971,7 @@
           <w:color w:val="000000"/>
           <w:sz w:val="18"/>
         </w:rPr>
+        <w:lastRenderedPageBreak/>
         <w:t>________________________________</w:t>
       </w:r>
       <w:r>
@@ -10064,6 +10178,52 @@
           <w:sz w:val="2"/>
         </w:rPr>
       </w:pPr>
+    </w:p>
+    <w:p>
+      <w:pPr>
+        <w:framePr w:w="3807" w:h="412" w:hRule="exact" w:wrap="auto" w:vAnchor="page" w:hAnchor="page" w:x="4205" w:y="16555"/>
+        <w:widowControl w:val="0"/>
+        <w:autoSpaceDE w:val="0"/>
+        <w:autoSpaceDN w:val="0"/>
+        <w:adjustRightInd w:val="0"/>
+        <w:spacing w:before="0" w:after="0" w:line="190" w:lineRule="exact"/>
+        <w:jc w:val="center"/>
+        <w:rPr>
+          <w:rFonts w:ascii="IEVRAA+ArialMT"/>
+          <w:color w:val="000000"/>
+          <w:sz w:val="16"/>
+          <w:szCs w:val="16"/>
+        </w:rPr>
+      </w:pPr>
+      <w:r>
+        <w:rPr>
+          <w:rFonts w:ascii="IEVRAA+ArialMT"/>
+          <w:color w:val="000000"/>
+          <w:sz w:val="16"/>
+          <w:szCs w:val="16"/>
+        </w:rPr>
+        <w:t>${</w:t>
+      </w:r>
+      <w:proofErr w:type="spellStart"/>
+      <w:r>
+        <w:rPr>
+          <w:rFonts w:ascii="IEVRAA+ArialMT"/>
+          <w:color w:val="000000"/>
+          <w:sz w:val="16"/>
+          <w:szCs w:val="16"/>
+        </w:rPr>
+        <w:t>CertifyDate</w:t>
+      </w:r>
+      <w:proofErr w:type="spellEnd"/>
+      <w:r>
+        <w:rPr>
+          <w:rFonts w:ascii="IEVRAA+ArialMT"/>
+          <w:color w:val="000000"/>
+          <w:sz w:val="16"/>
+          <w:szCs w:val="16"/>
+        </w:rPr>
+        <w:t>}</w:t>
+      </w:r>
     </w:p>
     <w:p>
       <w:pPr>
@@ -11002,7 +11162,7 @@
   <w:style w:type="paragraph" w:default="1" w:styleId="Normal">
     <w:name w:val="Normal"/>
     <w:qFormat/>
-    <w:rsid w:val="000D4F52"/>
+    <w:rsid w:val="00491634"/>
     <w:pPr>
       <w:spacing w:before="120" w:after="240"/>
       <w:jc w:val="both"/>

</xml_diff>

<commit_message>
Logic partially done, form 6 done
</commit_message>
<xml_diff>
--- a/public/assets/WORDFORM-6.docx
+++ b/public/assets/WORDFORM-6.docx
@@ -5604,6 +5604,54 @@
           <w:sz w:val="18"/>
         </w:rPr>
         <w:t>Requested</w:t>
+      </w:r>
+    </w:p>
+    <w:p>
+      <w:pPr>
+        <w:framePr w:w="3262" w:h="412" w:hRule="exact" w:wrap="auto" w:vAnchor="page" w:hAnchor="page" w:x="807" w:y="11463"/>
+        <w:widowControl w:val="0"/>
+        <w:autoSpaceDE w:val="0"/>
+        <w:autoSpaceDN w:val="0"/>
+        <w:adjustRightInd w:val="0"/>
+        <w:spacing w:before="0" w:after="0" w:line="190" w:lineRule="exact"/>
+        <w:jc w:val="left"/>
+        <w:rPr>
+          <w:rFonts w:ascii="IEVRAA+ArialMT"/>
+          <w:color w:val="000000"/>
+          <w:sz w:val="18"/>
+        </w:rPr>
+      </w:pPr>
+      <w:r>
+        <w:rPr>
+          <w:rFonts w:ascii="IEVRAA+ArialMT"/>
+          <w:color w:val="000000"/>
+          <w:sz w:val="18"/>
+        </w:rPr>
+        <w:t>$</w:t>
+      </w:r>
+      <w:r>
+        <w:rPr>
+          <w:rFonts w:ascii="IEVRAA+ArialMT"/>
+          <w:color w:val="000000"/>
+          <w:sz w:val="18"/>
+        </w:rPr>
+        <w:t>{</w:t>
+      </w:r>
+      <w:r>
+        <w:rPr>
+          <w:rFonts w:ascii="IEVRAA+ArialMT"/>
+          <w:color w:val="000000"/>
+          <w:sz w:val="18"/>
+        </w:rPr>
+        <w:t>date</w:t>
+      </w:r>
+      <w:r>
+        <w:rPr>
+          <w:rFonts w:ascii="IEVRAA+ArialMT"/>
+          <w:color w:val="000000"/>
+          <w:sz w:val="18"/>
+        </w:rPr>
+        <w:t>}</w:t>
       </w:r>
     </w:p>
     <w:p>
@@ -8482,7 +8530,7 @@
     </w:p>
     <w:p>
       <w:pPr>
-        <w:framePr w:w="6400" w:wrap="auto" w:vAnchor="page" w:hAnchor="page" w:x="958" w:y="9401"/>
+        <w:framePr w:w="4666" w:wrap="auto" w:vAnchor="page" w:hAnchor="page" w:x="830" w:y="11562"/>
         <w:widowControl w:val="0"/>
         <w:autoSpaceDE w:val="0"/>
         <w:autoSpaceDN w:val="0"/>
@@ -8492,88 +8540,6 @@
         <w:rPr>
           <w:rFonts w:ascii="IEVRAA+ArialMT"/>
           <w:color w:val="000000"/>
-          <w:sz w:val="14"/>
-          <w:szCs w:val="14"/>
-        </w:rPr>
-      </w:pPr>
-      <w:r>
-        <w:rPr>
-          <w:rFonts w:ascii="IEVRAA+ArialMT"/>
-          <w:color w:val="000000"/>
-          <w:sz w:val="18"/>
-          <w:szCs w:val="18"/>
-        </w:rPr>
-        <w:t>${</w:t>
-      </w:r>
-      <w:proofErr w:type="spellStart"/>
-      <w:r>
-        <w:rPr>
-          <w:rFonts w:ascii="IEVRAA+ArialMT"/>
-          <w:color w:val="000000"/>
-          <w:sz w:val="18"/>
-          <w:szCs w:val="18"/>
-        </w:rPr>
-        <w:t>type_</w:t>
-      </w:r>
-      <w:r>
-        <w:rPr>
-          <w:rFonts w:ascii="IEVRAA+ArialMT"/>
-          <w:color w:val="000000"/>
-          <w:sz w:val="18"/>
-          <w:szCs w:val="18"/>
-        </w:rPr>
-        <w:t>wellness</w:t>
-      </w:r>
-      <w:proofErr w:type="spellEnd"/>
-      <w:r>
-        <w:rPr>
-          <w:rFonts w:ascii="IEVRAA+ArialMT"/>
-          <w:color w:val="000000"/>
-          <w:sz w:val="18"/>
-          <w:szCs w:val="18"/>
-        </w:rPr>
-        <w:t>}</w:t>
-      </w:r>
-      <w:r>
-        <w:rPr>
-          <w:rFonts w:ascii="IEVRAA+ArialMT"/>
-          <w:color w:val="000000"/>
-          <w:sz w:val="14"/>
-          <w:szCs w:val="14"/>
-        </w:rPr>
-        <w:t xml:space="preserve"> </w:t>
-      </w:r>
-      <w:r>
-        <w:rPr>
-          <w:rFonts w:ascii="IEVRAA+ArialMT"/>
-          <w:color w:val="000000"/>
-          <w:sz w:val="14"/>
-          <w:szCs w:val="14"/>
-        </w:rPr>
-        <w:t>Wellness Leave</w:t>
-      </w:r>
-      <w:r>
-        <w:rPr>
-          <w:rFonts w:ascii="IEVRAA+ArialMT"/>
-          <w:color w:val="000000"/>
-          <w:sz w:val="14"/>
-          <w:szCs w:val="14"/>
-        </w:rPr>
-        <w:t xml:space="preserve"> </w:t>
-      </w:r>
-    </w:p>
-    <w:p>
-      <w:pPr>
-        <w:framePr w:w="4666" w:wrap="auto" w:vAnchor="page" w:hAnchor="page" w:x="830" w:y="11562"/>
-        <w:widowControl w:val="0"/>
-        <w:autoSpaceDE w:val="0"/>
-        <w:autoSpaceDN w:val="0"/>
-        <w:adjustRightInd w:val="0"/>
-        <w:spacing w:before="0" w:after="0" w:line="190" w:lineRule="exact"/>
-        <w:jc w:val="left"/>
-        <w:rPr>
-          <w:rFonts w:ascii="IEVRAA+ArialMT"/>
-          <w:color w:val="000000"/>
           <w:sz w:val="18"/>
         </w:rPr>
       </w:pPr>
@@ -8584,238 +8550,6 @@
           <w:sz w:val="18"/>
         </w:rPr>
         <w:t>__________________________________</w:t>
-      </w:r>
-    </w:p>
-    <w:p>
-      <w:pPr>
-        <w:framePr w:w="1237" w:wrap="auto" w:vAnchor="page" w:hAnchor="page" w:x="3261" w:y="13613"/>
-        <w:widowControl w:val="0"/>
-        <w:autoSpaceDE w:val="0"/>
-        <w:autoSpaceDN w:val="0"/>
-        <w:adjustRightInd w:val="0"/>
-        <w:spacing w:before="0" w:after="0" w:line="211" w:lineRule="exact"/>
-        <w:jc w:val="left"/>
-        <w:rPr>
-          <w:rFonts w:ascii="EEPAMF+Calibri-Bold"/>
-          <w:color w:val="000000"/>
-          <w:sz w:val="20"/>
-        </w:rPr>
-      </w:pPr>
-      <w:r>
-        <w:rPr>
-          <w:rFonts w:ascii="EEPAMF+Calibri-Bold"/>
-          <w:color w:val="000000"/>
-          <w:sz w:val="20"/>
-        </w:rPr>
-        <w:t>${</w:t>
-      </w:r>
-      <w:r>
-        <w:rPr>
-          <w:rFonts w:ascii="EEPAMF+Calibri-Bold"/>
-          <w:color w:val="000000"/>
-          <w:sz w:val="20"/>
-        </w:rPr>
-        <w:t>VL_CREDIT</w:t>
-      </w:r>
-      <w:r>
-        <w:rPr>
-          <w:rFonts w:ascii="EEPAMF+Calibri-Bold"/>
-          <w:color w:val="000000"/>
-          <w:sz w:val="20"/>
-        </w:rPr>
-        <w:t>}</w:t>
-      </w:r>
-    </w:p>
-    <w:p>
-      <w:pPr>
-        <w:framePr w:w="1685" w:wrap="auto" w:vAnchor="page" w:hAnchor="page" w:x="3262" w:y="13884"/>
-        <w:widowControl w:val="0"/>
-        <w:autoSpaceDE w:val="0"/>
-        <w:autoSpaceDN w:val="0"/>
-        <w:adjustRightInd w:val="0"/>
-        <w:spacing w:before="0" w:after="0" w:line="211" w:lineRule="exact"/>
-        <w:jc w:val="left"/>
-        <w:rPr>
-          <w:rFonts w:ascii="EEPAMF+Calibri-Bold"/>
-          <w:color w:val="000000"/>
-          <w:sz w:val="20"/>
-        </w:rPr>
-      </w:pPr>
-      <w:r>
-        <w:rPr>
-          <w:rFonts w:ascii="EEPAMF+Calibri-Bold"/>
-          <w:color w:val="000000"/>
-          <w:sz w:val="20"/>
-        </w:rPr>
-        <w:t>${</w:t>
-      </w:r>
-      <w:r>
-        <w:rPr>
-          <w:rFonts w:ascii="EEPAMF+Calibri-Bold"/>
-          <w:color w:val="000000"/>
-          <w:sz w:val="20"/>
-        </w:rPr>
-        <w:t>LESSVL_CREDIT</w:t>
-      </w:r>
-      <w:r>
-        <w:rPr>
-          <w:rFonts w:ascii="EEPAMF+Calibri-Bold"/>
-          <w:color w:val="000000"/>
-          <w:sz w:val="20"/>
-        </w:rPr>
-        <w:t>}</w:t>
-      </w:r>
-    </w:p>
-    <w:p>
-      <w:pPr>
-        <w:framePr w:w="1479" w:wrap="auto" w:vAnchor="page" w:hAnchor="page" w:x="3275" w:y="14156"/>
-        <w:widowControl w:val="0"/>
-        <w:autoSpaceDE w:val="0"/>
-        <w:autoSpaceDN w:val="0"/>
-        <w:adjustRightInd w:val="0"/>
-        <w:spacing w:before="0" w:after="0" w:line="211" w:lineRule="exact"/>
-        <w:jc w:val="left"/>
-        <w:rPr>
-          <w:rFonts w:ascii="EEPAMF+Calibri-Bold"/>
-          <w:color w:val="000000"/>
-          <w:sz w:val="20"/>
-        </w:rPr>
-      </w:pPr>
-      <w:r>
-        <w:rPr>
-          <w:rFonts w:ascii="EEPAMF+Calibri-Bold"/>
-          <w:color w:val="000000"/>
-          <w:sz w:val="20"/>
-        </w:rPr>
-        <w:t>${</w:t>
-      </w:r>
-      <w:r>
-        <w:rPr>
-          <w:rFonts w:ascii="EEPAMF+Calibri-Bold"/>
-          <w:color w:val="000000"/>
-          <w:sz w:val="20"/>
-        </w:rPr>
-        <w:t>VL_BALANCE</w:t>
-      </w:r>
-      <w:r>
-        <w:rPr>
-          <w:rFonts w:ascii="EEPAMF+Calibri-Bold"/>
-          <w:color w:val="000000"/>
-          <w:sz w:val="20"/>
-        </w:rPr>
-        <w:t>}</w:t>
-      </w:r>
-    </w:p>
-    <w:p>
-      <w:pPr>
-        <w:framePr w:w="1479" w:wrap="auto" w:vAnchor="page" w:hAnchor="page" w:x="4891" w:y="13599"/>
-        <w:widowControl w:val="0"/>
-        <w:autoSpaceDE w:val="0"/>
-        <w:autoSpaceDN w:val="0"/>
-        <w:adjustRightInd w:val="0"/>
-        <w:spacing w:before="0" w:after="0" w:line="211" w:lineRule="exact"/>
-        <w:jc w:val="left"/>
-        <w:rPr>
-          <w:rFonts w:ascii="EEPAMF+Calibri-Bold"/>
-          <w:color w:val="000000"/>
-          <w:sz w:val="20"/>
-        </w:rPr>
-      </w:pPr>
-      <w:r>
-        <w:rPr>
-          <w:rFonts w:ascii="EEPAMF+Calibri-Bold"/>
-          <w:color w:val="000000"/>
-          <w:sz w:val="20"/>
-        </w:rPr>
-        <w:t>${</w:t>
-      </w:r>
-      <w:r>
-        <w:rPr>
-          <w:rFonts w:ascii="EEPAMF+Calibri-Bold"/>
-          <w:color w:val="000000"/>
-          <w:sz w:val="20"/>
-        </w:rPr>
-        <w:t>SL_</w:t>
-      </w:r>
-      <w:r>
-        <w:rPr>
-          <w:rFonts w:ascii="EEPAMF+Calibri-Bold" w:cs="IEVRAA+ArialMT"/>
-          <w:color w:val="000000"/>
-          <w:sz w:val="20"/>
-        </w:rPr>
-        <w:t>CREDIT</w:t>
-      </w:r>
-      <w:r>
-        <w:rPr>
-          <w:rFonts w:ascii="EEPAMF+Calibri-Bold"/>
-          <w:color w:val="000000"/>
-          <w:sz w:val="20"/>
-        </w:rPr>
-        <w:t>}</w:t>
-      </w:r>
-    </w:p>
-    <w:p>
-      <w:pPr>
-        <w:framePr w:w="2609" w:wrap="auto" w:vAnchor="page" w:hAnchor="page" w:x="4892" w:y="13858"/>
-        <w:widowControl w:val="0"/>
-        <w:autoSpaceDE w:val="0"/>
-        <w:autoSpaceDN w:val="0"/>
-        <w:adjustRightInd w:val="0"/>
-        <w:spacing w:before="0" w:after="0" w:line="211" w:lineRule="exact"/>
-        <w:jc w:val="left"/>
-        <w:rPr>
-          <w:rFonts w:ascii="EEPAMF+Calibri-Bold" w:cs="IEVRAA+ArialMT"/>
-          <w:color w:val="000000"/>
-          <w:sz w:val="20"/>
-        </w:rPr>
-      </w:pPr>
-      <w:r>
-        <w:rPr>
-          <w:rFonts w:ascii="EEPAMF+Calibri-Bold" w:cs="IEVRAA+ArialMT"/>
-          <w:color w:val="000000"/>
-          <w:sz w:val="20"/>
-        </w:rPr>
-        <w:t>${LESSSL_CREDIT}</w:t>
-      </w:r>
-    </w:p>
-    <w:p>
-      <w:pPr>
-        <w:framePr w:w="1479" w:wrap="auto" w:vAnchor="page" w:hAnchor="page" w:x="4891" w:y="14143"/>
-        <w:widowControl w:val="0"/>
-        <w:autoSpaceDE w:val="0"/>
-        <w:autoSpaceDN w:val="0"/>
-        <w:adjustRightInd w:val="0"/>
-        <w:spacing w:before="0" w:after="0" w:line="211" w:lineRule="exact"/>
-        <w:jc w:val="left"/>
-        <w:rPr>
-          <w:rFonts w:ascii="EEPAMF+Calibri-Bold"/>
-          <w:color w:val="000000"/>
-          <w:sz w:val="20"/>
-        </w:rPr>
-      </w:pPr>
-      <w:r>
-        <w:rPr>
-          <w:rFonts w:ascii="EEPAMF+Calibri-Bold"/>
-          <w:color w:val="000000"/>
-          <w:sz w:val="20"/>
-        </w:rPr>
-        <w:t>${</w:t>
-      </w:r>
-      <w:r>
-        <w:rPr>
-          <w:rFonts w:ascii="EEPAMF+Calibri-Bold"/>
-          <w:color w:val="000000"/>
-          <w:sz w:val="20"/>
-        </w:rPr>
-        <w:t>SL_BALANCE</w:t>
-      </w:r>
-      <w:r>
-        <w:rPr>
-          <w:rFonts w:ascii="EEPAMF+Calibri-Bold"/>
-          <w:color w:val="000000"/>
-          <w:sz w:val="20"/>
-        </w:rPr>
-        <w:t>}</w:t>
       </w:r>
     </w:p>
     <w:p>
@@ -8892,48 +8626,6 @@
     </w:p>
     <w:p>
       <w:pPr>
-        <w:framePr w:w="1479" w:wrap="auto" w:vAnchor="page" w:hAnchor="page" w:x="1404" w:y="9993"/>
-        <w:widowControl w:val="0"/>
-        <w:autoSpaceDE w:val="0"/>
-        <w:autoSpaceDN w:val="0"/>
-        <w:adjustRightInd w:val="0"/>
-        <w:spacing w:before="0" w:after="0" w:line="211" w:lineRule="exact"/>
-        <w:jc w:val="left"/>
-        <w:rPr>
-          <w:rFonts w:ascii="EEPAMF+Calibri-Bold"/>
-          <w:color w:val="000000"/>
-          <w:sz w:val="20"/>
-        </w:rPr>
-      </w:pPr>
-      <w:r>
-        <w:rPr>
-          <w:rFonts w:ascii="EEPAMF+Calibri-Bold"/>
-          <w:color w:val="000000"/>
-          <w:sz w:val="20"/>
-        </w:rPr>
-        <w:t>${</w:t>
-      </w:r>
-      <w:proofErr w:type="spellStart"/>
-      <w:r>
-        <w:rPr>
-          <w:rFonts w:ascii="EEPAMF+Calibri-Bold"/>
-          <w:color w:val="000000"/>
-          <w:sz w:val="20"/>
-        </w:rPr>
-        <w:t>type_others</w:t>
-      </w:r>
-      <w:proofErr w:type="spellEnd"/>
-      <w:r>
-        <w:rPr>
-          <w:rFonts w:ascii="EEPAMF+Calibri-Bold"/>
-          <w:color w:val="000000"/>
-          <w:sz w:val="20"/>
-        </w:rPr>
-        <w:t>}</w:t>
-      </w:r>
-    </w:p>
-    <w:p>
-      <w:pPr>
         <w:framePr w:w="3807" w:h="412" w:hRule="exact" w:wrap="auto" w:vAnchor="page" w:hAnchor="page" w:x="7501" w:y="14875"/>
         <w:widowControl w:val="0"/>
         <w:autoSpaceDE w:val="0"/>
@@ -8966,6 +8658,56 @@
     </w:p>
     <w:p>
       <w:pPr>
+        <w:framePr w:w="4056" w:h="412" w:hRule="exact" w:wrap="auto" w:vAnchor="page" w:hAnchor="page" w:x="104" w:y="9989"/>
+        <w:widowControl w:val="0"/>
+        <w:autoSpaceDE w:val="0"/>
+        <w:autoSpaceDN w:val="0"/>
+        <w:adjustRightInd w:val="0"/>
+        <w:spacing w:before="0" w:after="0" w:line="190" w:lineRule="exact"/>
+        <w:jc w:val="center"/>
+        <w:rPr>
+          <w:rFonts w:ascii="IEVRAA+ArialMT"/>
+          <w:color w:val="000000"/>
+          <w:sz w:val="18"/>
+        </w:rPr>
+      </w:pPr>
+      <w:r>
+        <w:rPr>
+          <w:rFonts w:ascii="IEVRAA+ArialMT"/>
+          <w:color w:val="000000"/>
+          <w:sz w:val="18"/>
+        </w:rPr>
+        <w:t>$</w:t>
+      </w:r>
+      <w:r>
+        <w:rPr>
+          <w:rFonts w:ascii="IEVRAA+ArialMT"/>
+          <w:color w:val="000000"/>
+          <w:sz w:val="18"/>
+        </w:rPr>
+        <w:t>{</w:t>
+      </w:r>
+      <w:proofErr w:type="spellStart"/>
+      <w:r>
+        <w:rPr>
+          <w:rFonts w:ascii="IEVRAA+ArialMT"/>
+          <w:color w:val="000000"/>
+          <w:sz w:val="18"/>
+        </w:rPr>
+        <w:t>type_others</w:t>
+      </w:r>
+      <w:proofErr w:type="spellEnd"/>
+      <w:r>
+        <w:rPr>
+          <w:rFonts w:ascii="IEVRAA+ArialMT"/>
+          <w:color w:val="000000"/>
+          <w:sz w:val="18"/>
+        </w:rPr>
+        <w:t>}</w:t>
+      </w:r>
+    </w:p>
+    <w:p>
+      <w:pPr>
         <w:rPr>
           <w:rFonts w:ascii="Arial"/>
           <w:sz w:val="2"/>
@@ -9129,9 +8871,8 @@
           <w:sz w:val="16"/>
           <w:szCs w:val="16"/>
         </w:rPr>
-        <w:t>CertifyDate</w:t>
-      </w:r>
-      <w:proofErr w:type="spellEnd"/>
+        <w:t>reco</w:t>
+      </w:r>
       <w:r>
         <w:rPr>
           <w:rFonts w:ascii="IEVRAA+ArialMT"/>
@@ -9139,6 +8880,16 @@
           <w:sz w:val="16"/>
           <w:szCs w:val="16"/>
         </w:rPr>
+        <w:t>Date</w:t>
+      </w:r>
+      <w:proofErr w:type="spellEnd"/>
+      <w:r>
+        <w:rPr>
+          <w:rFonts w:ascii="IEVRAA+ArialMT"/>
+          <w:color w:val="000000"/>
+          <w:sz w:val="16"/>
+          <w:szCs w:val="16"/>
+        </w:rPr>
         <w:t>}</w:t>
       </w:r>
     </w:p>
@@ -9192,6 +8943,482 @@
     </w:p>
     <w:p>
       <w:pPr>
+        <w:framePr w:w="1763" w:h="289" w:hRule="exact" w:wrap="auto" w:vAnchor="page" w:hAnchor="page" w:x="2674" w:y="14171"/>
+        <w:widowControl w:val="0"/>
+        <w:autoSpaceDE w:val="0"/>
+        <w:autoSpaceDN w:val="0"/>
+        <w:adjustRightInd w:val="0"/>
+        <w:spacing w:before="0" w:after="0" w:line="190" w:lineRule="exact"/>
+        <w:jc w:val="center"/>
+        <w:rPr>
+          <w:rFonts w:ascii="IEVRAA+ArialMT"/>
+          <w:color w:val="000000"/>
+          <w:sz w:val="18"/>
+        </w:rPr>
+      </w:pPr>
+      <w:r>
+        <w:rPr>
+          <w:rFonts w:ascii="IEVRAA+ArialMT"/>
+          <w:color w:val="000000"/>
+          <w:sz w:val="18"/>
+        </w:rPr>
+        <w:t>$</w:t>
+      </w:r>
+      <w:r>
+        <w:rPr>
+          <w:rFonts w:ascii="IEVRAA+ArialMT"/>
+          <w:color w:val="000000"/>
+          <w:sz w:val="18"/>
+        </w:rPr>
+        <w:t>{</w:t>
+      </w:r>
+      <w:r>
+        <w:rPr>
+          <w:rFonts w:ascii="IEVRAA+ArialMT"/>
+          <w:color w:val="000000"/>
+          <w:sz w:val="18"/>
+        </w:rPr>
+        <w:t>V</w:t>
+      </w:r>
+      <w:r>
+        <w:rPr>
+          <w:rFonts w:ascii="IEVRAA+ArialMT"/>
+          <w:color w:val="000000"/>
+          <w:sz w:val="18"/>
+        </w:rPr>
+        <w:t>L_BALANCE</w:t>
+      </w:r>
+      <w:r>
+        <w:rPr>
+          <w:rFonts w:ascii="IEVRAA+ArialMT"/>
+          <w:color w:val="000000"/>
+          <w:sz w:val="18"/>
+        </w:rPr>
+        <w:t>}</w:t>
+      </w:r>
+    </w:p>
+    <w:p>
+      <w:pPr>
+        <w:framePr w:w="1763" w:h="289" w:hRule="exact" w:wrap="auto" w:vAnchor="page" w:hAnchor="page" w:x="4310" w:y="13883"/>
+        <w:widowControl w:val="0"/>
+        <w:autoSpaceDE w:val="0"/>
+        <w:autoSpaceDN w:val="0"/>
+        <w:adjustRightInd w:val="0"/>
+        <w:spacing w:before="0" w:after="0" w:line="190" w:lineRule="exact"/>
+        <w:jc w:val="center"/>
+        <w:rPr>
+          <w:rFonts w:ascii="IEVRAA+ArialMT"/>
+          <w:color w:val="000000"/>
+          <w:sz w:val="18"/>
+        </w:rPr>
+      </w:pPr>
+      <w:r>
+        <w:rPr>
+          <w:rFonts w:ascii="IEVRAA+ArialMT"/>
+          <w:color w:val="000000"/>
+          <w:sz w:val="18"/>
+        </w:rPr>
+        <w:t>$</w:t>
+      </w:r>
+      <w:r>
+        <w:rPr>
+          <w:rFonts w:ascii="IEVRAA+ArialMT"/>
+          <w:color w:val="000000"/>
+          <w:sz w:val="18"/>
+        </w:rPr>
+        <w:t>{</w:t>
+      </w:r>
+      <w:r>
+        <w:rPr>
+          <w:rFonts w:ascii="IEVRAA+ArialMT"/>
+          <w:color w:val="000000"/>
+          <w:sz w:val="18"/>
+        </w:rPr>
+        <w:t>LESSSL_CREDIT</w:t>
+      </w:r>
+      <w:r>
+        <w:rPr>
+          <w:rFonts w:ascii="IEVRAA+ArialMT"/>
+          <w:color w:val="000000"/>
+          <w:sz w:val="18"/>
+        </w:rPr>
+        <w:t>}</w:t>
+      </w:r>
+    </w:p>
+    <w:p>
+      <w:pPr>
+        <w:framePr w:w="1763" w:h="289" w:hRule="exact" w:wrap="auto" w:vAnchor="page" w:hAnchor="page" w:x="4286" w:y="13618"/>
+        <w:widowControl w:val="0"/>
+        <w:autoSpaceDE w:val="0"/>
+        <w:autoSpaceDN w:val="0"/>
+        <w:adjustRightInd w:val="0"/>
+        <w:spacing w:before="0" w:after="0" w:line="190" w:lineRule="exact"/>
+        <w:jc w:val="center"/>
+        <w:rPr>
+          <w:rFonts w:ascii="IEVRAA+ArialMT"/>
+          <w:color w:val="000000"/>
+          <w:sz w:val="18"/>
+        </w:rPr>
+      </w:pPr>
+      <w:r>
+        <w:rPr>
+          <w:rFonts w:ascii="IEVRAA+ArialMT"/>
+          <w:color w:val="000000"/>
+          <w:sz w:val="18"/>
+        </w:rPr>
+        <w:t>$</w:t>
+      </w:r>
+      <w:r>
+        <w:rPr>
+          <w:rFonts w:ascii="IEVRAA+ArialMT"/>
+          <w:color w:val="000000"/>
+          <w:sz w:val="18"/>
+        </w:rPr>
+        <w:t>{</w:t>
+      </w:r>
+      <w:r>
+        <w:rPr>
+          <w:rFonts w:ascii="IEVRAA+ArialMT"/>
+          <w:color w:val="000000"/>
+          <w:sz w:val="18"/>
+        </w:rPr>
+        <w:t>SL_CREDIT</w:t>
+      </w:r>
+      <w:r>
+        <w:rPr>
+          <w:rFonts w:ascii="IEVRAA+ArialMT"/>
+          <w:color w:val="000000"/>
+          <w:sz w:val="18"/>
+        </w:rPr>
+        <w:t>}</w:t>
+      </w:r>
+    </w:p>
+    <w:p>
+      <w:pPr>
+        <w:framePr w:w="1763" w:h="289" w:hRule="exact" w:wrap="auto" w:vAnchor="page" w:hAnchor="page" w:x="2662" w:y="13630"/>
+        <w:widowControl w:val="0"/>
+        <w:autoSpaceDE w:val="0"/>
+        <w:autoSpaceDN w:val="0"/>
+        <w:adjustRightInd w:val="0"/>
+        <w:spacing w:before="0" w:after="0" w:line="190" w:lineRule="exact"/>
+        <w:jc w:val="center"/>
+        <w:rPr>
+          <w:rFonts w:ascii="IEVRAA+ArialMT"/>
+          <w:color w:val="000000"/>
+          <w:sz w:val="18"/>
+        </w:rPr>
+      </w:pPr>
+      <w:r>
+        <w:rPr>
+          <w:rFonts w:ascii="IEVRAA+ArialMT"/>
+          <w:color w:val="000000"/>
+          <w:sz w:val="18"/>
+        </w:rPr>
+        <w:t>$</w:t>
+      </w:r>
+      <w:r>
+        <w:rPr>
+          <w:rFonts w:ascii="IEVRAA+ArialMT"/>
+          <w:color w:val="000000"/>
+          <w:sz w:val="18"/>
+        </w:rPr>
+        <w:t>{</w:t>
+      </w:r>
+      <w:r>
+        <w:rPr>
+          <w:rFonts w:ascii="IEVRAA+ArialMT"/>
+          <w:color w:val="000000"/>
+          <w:sz w:val="18"/>
+        </w:rPr>
+        <w:t>V</w:t>
+      </w:r>
+      <w:r>
+        <w:rPr>
+          <w:rFonts w:ascii="IEVRAA+ArialMT"/>
+          <w:color w:val="000000"/>
+          <w:sz w:val="18"/>
+        </w:rPr>
+        <w:t>L_CREDIT</w:t>
+      </w:r>
+      <w:r>
+        <w:rPr>
+          <w:rFonts w:ascii="IEVRAA+ArialMT"/>
+          <w:color w:val="000000"/>
+          <w:sz w:val="18"/>
+        </w:rPr>
+        <w:t>}</w:t>
+      </w:r>
+    </w:p>
+    <w:p>
+      <w:pPr>
+        <w:framePr w:w="1763" w:h="289" w:hRule="exact" w:wrap="auto" w:vAnchor="page" w:hAnchor="page" w:x="2685" w:y="13894"/>
+        <w:widowControl w:val="0"/>
+        <w:autoSpaceDE w:val="0"/>
+        <w:autoSpaceDN w:val="0"/>
+        <w:adjustRightInd w:val="0"/>
+        <w:spacing w:before="0" w:after="0" w:line="190" w:lineRule="exact"/>
+        <w:jc w:val="center"/>
+        <w:rPr>
+          <w:rFonts w:ascii="IEVRAA+ArialMT"/>
+          <w:color w:val="000000"/>
+          <w:sz w:val="18"/>
+        </w:rPr>
+      </w:pPr>
+      <w:r>
+        <w:rPr>
+          <w:rFonts w:ascii="IEVRAA+ArialMT"/>
+          <w:color w:val="000000"/>
+          <w:sz w:val="18"/>
+        </w:rPr>
+        <w:t>$</w:t>
+      </w:r>
+      <w:r>
+        <w:rPr>
+          <w:rFonts w:ascii="IEVRAA+ArialMT"/>
+          <w:color w:val="000000"/>
+          <w:sz w:val="18"/>
+        </w:rPr>
+        <w:t>{</w:t>
+      </w:r>
+      <w:r>
+        <w:rPr>
+          <w:rFonts w:ascii="IEVRAA+ArialMT"/>
+          <w:color w:val="000000"/>
+          <w:sz w:val="18"/>
+        </w:rPr>
+        <w:t>LES</w:t>
+      </w:r>
+      <w:r>
+        <w:rPr>
+          <w:rFonts w:ascii="IEVRAA+ArialMT"/>
+          <w:color w:val="000000"/>
+          <w:sz w:val="18"/>
+        </w:rPr>
+        <w:t>SV</w:t>
+      </w:r>
+      <w:r>
+        <w:rPr>
+          <w:rFonts w:ascii="IEVRAA+ArialMT"/>
+          <w:color w:val="000000"/>
+          <w:sz w:val="18"/>
+        </w:rPr>
+        <w:t>L_CREDIT</w:t>
+      </w:r>
+      <w:r>
+        <w:rPr>
+          <w:rFonts w:ascii="IEVRAA+ArialMT"/>
+          <w:color w:val="000000"/>
+          <w:sz w:val="18"/>
+        </w:rPr>
+        <w:t>}</w:t>
+      </w:r>
+    </w:p>
+    <w:p>
+      <w:pPr>
+        <w:framePr w:w="1763" w:h="289" w:hRule="exact" w:wrap="auto" w:vAnchor="page" w:hAnchor="page" w:x="4297" w:y="14182"/>
+        <w:widowControl w:val="0"/>
+        <w:autoSpaceDE w:val="0"/>
+        <w:autoSpaceDN w:val="0"/>
+        <w:adjustRightInd w:val="0"/>
+        <w:spacing w:before="0" w:after="0" w:line="190" w:lineRule="exact"/>
+        <w:jc w:val="center"/>
+        <w:rPr>
+          <w:rFonts w:ascii="IEVRAA+ArialMT"/>
+          <w:color w:val="000000"/>
+          <w:sz w:val="18"/>
+        </w:rPr>
+      </w:pPr>
+      <w:r>
+        <w:rPr>
+          <w:rFonts w:ascii="IEVRAA+ArialMT"/>
+          <w:color w:val="000000"/>
+          <w:sz w:val="18"/>
+        </w:rPr>
+        <w:t>$</w:t>
+      </w:r>
+      <w:r>
+        <w:rPr>
+          <w:rFonts w:ascii="IEVRAA+ArialMT"/>
+          <w:color w:val="000000"/>
+          <w:sz w:val="18"/>
+        </w:rPr>
+        <w:t>{</w:t>
+      </w:r>
+      <w:r>
+        <w:rPr>
+          <w:rFonts w:ascii="IEVRAA+ArialMT"/>
+          <w:color w:val="000000"/>
+          <w:sz w:val="18"/>
+        </w:rPr>
+        <w:t>SL_BALANCE</w:t>
+      </w:r>
+      <w:r>
+        <w:rPr>
+          <w:rFonts w:ascii="IEVRAA+ArialMT"/>
+          <w:color w:val="000000"/>
+          <w:sz w:val="18"/>
+        </w:rPr>
+        <w:t>}</w:t>
+      </w:r>
+    </w:p>
+    <w:p>
+      <w:pPr>
+        <w:framePr w:w="750" w:h="412" w:hRule="exact" w:wrap="auto" w:vAnchor="page" w:hAnchor="page" w:x="2224" w:y="10818"/>
+        <w:widowControl w:val="0"/>
+        <w:autoSpaceDE w:val="0"/>
+        <w:autoSpaceDN w:val="0"/>
+        <w:adjustRightInd w:val="0"/>
+        <w:spacing w:before="0" w:after="0" w:line="190" w:lineRule="exact"/>
+        <w:jc w:val="left"/>
+        <w:rPr>
+          <w:rFonts w:ascii="IEVRAA+ArialMT"/>
+          <w:color w:val="000000"/>
+          <w:sz w:val="18"/>
+        </w:rPr>
+      </w:pPr>
+      <w:r>
+        <w:rPr>
+          <w:rFonts w:ascii="IEVRAA+ArialMT"/>
+          <w:color w:val="000000"/>
+          <w:sz w:val="18"/>
+        </w:rPr>
+        <w:t>$</w:t>
+      </w:r>
+      <w:r>
+        <w:rPr>
+          <w:rFonts w:ascii="IEVRAA+ArialMT"/>
+          <w:color w:val="000000"/>
+          <w:sz w:val="18"/>
+        </w:rPr>
+        <w:t>{</w:t>
+      </w:r>
+      <w:r>
+        <w:rPr>
+          <w:rFonts w:ascii="IEVRAA+ArialMT"/>
+          <w:color w:val="000000"/>
+          <w:sz w:val="18"/>
+        </w:rPr>
+        <w:t>da</w:t>
+      </w:r>
+      <w:r>
+        <w:rPr>
+          <w:rFonts w:ascii="IEVRAA+ArialMT"/>
+          <w:color w:val="000000"/>
+          <w:sz w:val="18"/>
+        </w:rPr>
+        <w:t>y</w:t>
+      </w:r>
+      <w:r>
+        <w:rPr>
+          <w:rFonts w:ascii="IEVRAA+ArialMT"/>
+          <w:color w:val="000000"/>
+          <w:sz w:val="18"/>
+        </w:rPr>
+        <w:t>}</w:t>
+      </w:r>
+    </w:p>
+    <w:p>
+      <w:pPr>
+        <w:framePr w:w="1660" w:h="412" w:hRule="exact" w:wrap="auto" w:vAnchor="page" w:hAnchor="page" w:x="6843" w:y="13271"/>
+        <w:widowControl w:val="0"/>
+        <w:autoSpaceDE w:val="0"/>
+        <w:autoSpaceDN w:val="0"/>
+        <w:adjustRightInd w:val="0"/>
+        <w:spacing w:before="0" w:after="0" w:line="190" w:lineRule="exact"/>
+        <w:jc w:val="left"/>
+        <w:rPr>
+          <w:rFonts w:ascii="IEVRAA+ArialMT"/>
+          <w:color w:val="000000"/>
+          <w:sz w:val="18"/>
+        </w:rPr>
+      </w:pPr>
+      <w:r>
+        <w:rPr>
+          <w:rFonts w:ascii="IEVRAA+ArialMT"/>
+          <w:color w:val="000000"/>
+          <w:sz w:val="18"/>
+        </w:rPr>
+        <w:t>$</w:t>
+      </w:r>
+      <w:r>
+        <w:rPr>
+          <w:rFonts w:ascii="IEVRAA+ArialMT"/>
+          <w:color w:val="000000"/>
+          <w:sz w:val="18"/>
+        </w:rPr>
+        <w:t>{</w:t>
+      </w:r>
+      <w:proofErr w:type="spellStart"/>
+      <w:r>
+        <w:rPr>
+          <w:rFonts w:ascii="IEVRAA+ArialMT"/>
+          <w:color w:val="000000"/>
+          <w:sz w:val="18"/>
+        </w:rPr>
+        <w:t>fordisapproval</w:t>
+      </w:r>
+      <w:proofErr w:type="spellEnd"/>
+      <w:r>
+        <w:rPr>
+          <w:rFonts w:ascii="IEVRAA+ArialMT"/>
+          <w:color w:val="000000"/>
+          <w:sz w:val="18"/>
+        </w:rPr>
+        <w:t>}</w:t>
+      </w:r>
+    </w:p>
+    <w:p>
+      <w:pPr>
+        <w:framePr w:w="1660" w:h="412" w:hRule="exact" w:wrap="auto" w:vAnchor="page" w:hAnchor="page" w:x="6844" w:y="12937"/>
+        <w:widowControl w:val="0"/>
+        <w:autoSpaceDE w:val="0"/>
+        <w:autoSpaceDN w:val="0"/>
+        <w:adjustRightInd w:val="0"/>
+        <w:spacing w:before="0" w:after="0" w:line="190" w:lineRule="exact"/>
+        <w:jc w:val="left"/>
+        <w:rPr>
+          <w:rFonts w:ascii="IEVRAA+ArialMT"/>
+          <w:color w:val="000000"/>
+          <w:sz w:val="18"/>
+        </w:rPr>
+      </w:pPr>
+      <w:r>
+        <w:rPr>
+          <w:rFonts w:ascii="IEVRAA+ArialMT"/>
+          <w:color w:val="000000"/>
+          <w:sz w:val="18"/>
+        </w:rPr>
+        <w:t>$</w:t>
+      </w:r>
+      <w:r>
+        <w:rPr>
+          <w:rFonts w:ascii="IEVRAA+ArialMT"/>
+          <w:color w:val="000000"/>
+          <w:sz w:val="18"/>
+        </w:rPr>
+        <w:t>{</w:t>
+      </w:r>
+      <w:proofErr w:type="spellStart"/>
+      <w:r>
+        <w:rPr>
+          <w:rFonts w:ascii="IEVRAA+ArialMT"/>
+          <w:color w:val="000000"/>
+          <w:sz w:val="18"/>
+        </w:rPr>
+        <w:t>forapproval</w:t>
+      </w:r>
+      <w:proofErr w:type="spellEnd"/>
+      <w:r>
+        <w:rPr>
+          <w:rFonts w:ascii="IEVRAA+ArialMT"/>
+          <w:color w:val="000000"/>
+          <w:sz w:val="18"/>
+        </w:rPr>
+        <w:t>}</w:t>
+      </w:r>
+    </w:p>
+    <w:p>
+      <w:pPr>
         <w:rPr>
           <w:rFonts w:ascii="Arial"/>
           <w:sz w:val="2"/>
@@ -9413,38 +9640,6 @@
     </w:p>
     <w:p>
       <w:pPr>
-        <w:framePr w:w="1523" w:wrap="auto" w:vAnchor="page" w:hAnchor="page" w:x="1542" w:y="10794"/>
-        <w:widowControl w:val="0"/>
-        <w:autoSpaceDE w:val="0"/>
-        <w:autoSpaceDN w:val="0"/>
-        <w:adjustRightInd w:val="0"/>
-        <w:spacing w:before="0" w:after="0" w:line="211" w:lineRule="exact"/>
-        <w:jc w:val="left"/>
-        <w:rPr>
-          <w:rFonts w:ascii="EEPAMF+Calibri-Bold"/>
-          <w:color w:val="000000"/>
-          <w:sz w:val="20"/>
-        </w:rPr>
-      </w:pPr>
-      <w:r>
-        <w:rPr>
-          <w:rFonts w:ascii="EEPAMF+Calibri-Bold"/>
-          <w:color w:val="000000"/>
-          <w:sz w:val="20"/>
-        </w:rPr>
-        <w:t>$</w:t>
-      </w:r>
-      <w:r>
-        <w:rPr>
-          <w:rFonts w:ascii="EEPAMF+Calibri-Bold"/>
-          <w:color w:val="000000"/>
-          <w:sz w:val="20"/>
-        </w:rPr>
-        <w:t>{day}</w:t>
-      </w:r>
-    </w:p>
-    <w:p>
-      <w:pPr>
         <w:rPr>
           <w:rFonts w:ascii="Arial"/>
           <w:sz w:val="2"/>
@@ -9461,26 +9656,160 @@
     </w:p>
     <w:p>
       <w:pPr>
-        <w:framePr w:w="5266" w:wrap="auto" w:vAnchor="page" w:hAnchor="page" w:x="890" w:y="11459"/>
-        <w:widowControl w:val="0"/>
-        <w:autoSpaceDE w:val="0"/>
-        <w:autoSpaceDN w:val="0"/>
-        <w:adjustRightInd w:val="0"/>
-        <w:spacing w:before="0" w:after="0" w:line="211" w:lineRule="exact"/>
-        <w:jc w:val="left"/>
+        <w:framePr w:w="3816" w:wrap="auto" w:hAnchor="page" w:x="7242" w:y="15628"/>
+        <w:widowControl w:val="0"/>
+        <w:autoSpaceDE w:val="0"/>
+        <w:autoSpaceDN w:val="0"/>
+        <w:adjustRightInd w:val="0"/>
+        <w:spacing w:before="0" w:after="0" w:line="208" w:lineRule="exact"/>
+        <w:jc w:val="left"/>
+        <w:rPr>
+          <w:rFonts w:ascii="IEVRAA+ArialMT"/>
+          <w:color w:val="000000"/>
+          <w:sz w:val="20"/>
+        </w:rPr>
+      </w:pPr>
+      <w:r>
+        <w:rPr>
+          <w:rFonts w:ascii="IEVRAA+ArialMT"/>
+          <w:color w:val="000000"/>
+          <w:sz w:val="20"/>
+        </w:rPr>
+        <w:t>__________________________________</w:t>
+      </w:r>
+    </w:p>
+    <w:p>
+      <w:pPr>
+        <w:framePr w:w="3816" w:wrap="auto" w:hAnchor="page" w:x="7242" w:y="15628"/>
+        <w:widowControl w:val="0"/>
+        <w:autoSpaceDE w:val="0"/>
+        <w:autoSpaceDN w:val="0"/>
+        <w:adjustRightInd w:val="0"/>
+        <w:spacing w:before="52" w:after="0" w:line="190" w:lineRule="exact"/>
+        <w:jc w:val="left"/>
+        <w:rPr>
+          <w:rFonts w:ascii="IEVRAA+ArialMT"/>
+          <w:color w:val="000000"/>
+          <w:sz w:val="18"/>
+        </w:rPr>
+      </w:pPr>
+      <w:r>
+        <w:rPr>
+          <w:rFonts w:ascii="IEVRAA+ArialMT"/>
+          <w:color w:val="000000"/>
+          <w:sz w:val="18"/>
+        </w:rPr>
+        <w:t>______________________________________</w:t>
+      </w:r>
+    </w:p>
+    <w:p>
+      <w:pPr>
+        <w:framePr w:w="3816" w:wrap="auto" w:hAnchor="page" w:x="7242" w:y="15628"/>
+        <w:widowControl w:val="0"/>
+        <w:autoSpaceDE w:val="0"/>
+        <w:autoSpaceDN w:val="0"/>
+        <w:adjustRightInd w:val="0"/>
+        <w:spacing w:before="48" w:after="0" w:line="190" w:lineRule="exact"/>
+        <w:jc w:val="left"/>
+        <w:rPr>
+          <w:rFonts w:ascii="IEVRAA+ArialMT"/>
+          <w:color w:val="000000"/>
+          <w:sz w:val="18"/>
+        </w:rPr>
+      </w:pPr>
+      <w:r>
+        <w:rPr>
+          <w:rFonts w:ascii="IEVRAA+ArialMT"/>
+          <w:color w:val="000000"/>
+          <w:sz w:val="18"/>
+        </w:rPr>
+        <w:t>______________________________________</w:t>
+      </w:r>
+    </w:p>
+    <w:p>
+      <w:pPr>
+        <w:framePr w:w="3807" w:h="412" w:hRule="exact" w:wrap="auto" w:vAnchor="page" w:hAnchor="page" w:x="4136" w:y="16889"/>
+        <w:widowControl w:val="0"/>
+        <w:autoSpaceDE w:val="0"/>
+        <w:autoSpaceDN w:val="0"/>
+        <w:adjustRightInd w:val="0"/>
+        <w:spacing w:before="0" w:after="0" w:line="190" w:lineRule="exact"/>
+        <w:jc w:val="center"/>
+        <w:rPr>
+          <w:rFonts w:ascii="IEVRAA+ArialMT"/>
+          <w:color w:val="000000"/>
+          <w:sz w:val="16"/>
+          <w:szCs w:val="16"/>
+        </w:rPr>
+      </w:pPr>
+      <w:r>
+        <w:rPr>
+          <w:rFonts w:ascii="IEVRAA+ArialMT"/>
+          <w:color w:val="000000"/>
+          <w:sz w:val="16"/>
+          <w:szCs w:val="16"/>
+        </w:rPr>
+        <w:t>${</w:t>
+      </w:r>
+      <w:proofErr w:type="spellStart"/>
+      <w:r>
+        <w:rPr>
+          <w:rFonts w:ascii="IEVRAA+ArialMT"/>
+          <w:color w:val="000000"/>
+          <w:sz w:val="16"/>
+          <w:szCs w:val="16"/>
+        </w:rPr>
+        <w:t>Appro</w:t>
+      </w:r>
+      <w:r>
+        <w:rPr>
+          <w:rFonts w:ascii="IEVRAA+ArialMT"/>
+          <w:color w:val="000000"/>
+          <w:sz w:val="16"/>
+          <w:szCs w:val="16"/>
+        </w:rPr>
+        <w:t>Date</w:t>
+      </w:r>
+      <w:proofErr w:type="spellEnd"/>
+      <w:r>
+        <w:rPr>
+          <w:rFonts w:ascii="IEVRAA+ArialMT"/>
+          <w:color w:val="000000"/>
+          <w:sz w:val="16"/>
+          <w:szCs w:val="16"/>
+        </w:rPr>
+        <w:t>}</w:t>
+      </w:r>
+    </w:p>
+    <w:p>
+      <w:pPr>
+        <w:framePr w:w="4574" w:wrap="auto" w:vAnchor="page" w:hAnchor="page" w:x="3688" w:y="17005"/>
+        <w:widowControl w:val="0"/>
+        <w:autoSpaceDE w:val="0"/>
+        <w:autoSpaceDN w:val="0"/>
+        <w:adjustRightInd w:val="0"/>
+        <w:spacing w:before="26" w:after="0" w:line="211" w:lineRule="exact"/>
+        <w:jc w:val="center"/>
+        <w:rPr>
+          <w:color w:val="000000"/>
+          <w:sz w:val="20"/>
+        </w:rPr>
+      </w:pPr>
+      <w:r>
         <w:rPr>
           <w:rFonts w:ascii="EEPAMF+Calibri-Bold"/>
           <w:color w:val="000000"/>
           <w:sz w:val="20"/>
         </w:rPr>
-      </w:pPr>
+        <w:t>${</w:t>
+      </w:r>
       <w:r>
         <w:rPr>
           <w:rFonts w:ascii="EEPAMF+Calibri-Bold"/>
           <w:color w:val="000000"/>
           <w:sz w:val="20"/>
         </w:rPr>
-        <w:t>$</w:t>
+        <w:t>APPROVESIGN</w:t>
       </w:r>
       <w:r>
         <w:rPr>
@@ -9488,79 +9817,7 @@
           <w:color w:val="000000"/>
           <w:sz w:val="20"/>
         </w:rPr>
-        <w:t>{date}</w:t>
-      </w:r>
-    </w:p>
-    <w:p>
-      <w:pPr>
-        <w:framePr w:w="3816" w:wrap="auto" w:hAnchor="page" w:x="7242" w:y="15628"/>
-        <w:widowControl w:val="0"/>
-        <w:autoSpaceDE w:val="0"/>
-        <w:autoSpaceDN w:val="0"/>
-        <w:adjustRightInd w:val="0"/>
-        <w:spacing w:before="0" w:after="0" w:line="208" w:lineRule="exact"/>
-        <w:jc w:val="left"/>
-        <w:rPr>
-          <w:rFonts w:ascii="IEVRAA+ArialMT"/>
-          <w:color w:val="000000"/>
-          <w:sz w:val="20"/>
-        </w:rPr>
-      </w:pPr>
-      <w:r>
-        <w:rPr>
-          <w:rFonts w:ascii="IEVRAA+ArialMT"/>
-          <w:color w:val="000000"/>
-          <w:sz w:val="20"/>
-        </w:rPr>
-        <w:t>__________________________________</w:t>
-      </w:r>
-    </w:p>
-    <w:p>
-      <w:pPr>
-        <w:framePr w:w="3816" w:wrap="auto" w:hAnchor="page" w:x="7242" w:y="15628"/>
-        <w:widowControl w:val="0"/>
-        <w:autoSpaceDE w:val="0"/>
-        <w:autoSpaceDN w:val="0"/>
-        <w:adjustRightInd w:val="0"/>
-        <w:spacing w:before="52" w:after="0" w:line="190" w:lineRule="exact"/>
-        <w:jc w:val="left"/>
-        <w:rPr>
-          <w:rFonts w:ascii="IEVRAA+ArialMT"/>
-          <w:color w:val="000000"/>
-          <w:sz w:val="18"/>
-        </w:rPr>
-      </w:pPr>
-      <w:r>
-        <w:rPr>
-          <w:rFonts w:ascii="IEVRAA+ArialMT"/>
-          <w:color w:val="000000"/>
-          <w:sz w:val="18"/>
-        </w:rPr>
-        <w:t>______________________________________</w:t>
-      </w:r>
-    </w:p>
-    <w:p>
-      <w:pPr>
-        <w:framePr w:w="3816" w:wrap="auto" w:hAnchor="page" w:x="7242" w:y="15628"/>
-        <w:widowControl w:val="0"/>
-        <w:autoSpaceDE w:val="0"/>
-        <w:autoSpaceDN w:val="0"/>
-        <w:adjustRightInd w:val="0"/>
-        <w:spacing w:before="48" w:after="0" w:line="190" w:lineRule="exact"/>
-        <w:jc w:val="left"/>
-        <w:rPr>
-          <w:rFonts w:ascii="IEVRAA+ArialMT"/>
-          <w:color w:val="000000"/>
-          <w:sz w:val="18"/>
-        </w:rPr>
-      </w:pPr>
-      <w:r>
-        <w:rPr>
-          <w:rFonts w:ascii="IEVRAA+ArialMT"/>
-          <w:color w:val="000000"/>
-          <w:sz w:val="18"/>
-        </w:rPr>
-        <w:t>______________________________________</w:t>
+        <w:t>}</w:t>
       </w:r>
     </w:p>
     <w:p>
@@ -9570,6 +9827,30 @@
           <w:sz w:val="2"/>
         </w:rPr>
       </w:pPr>
+    </w:p>
+    <w:p>
+      <w:pPr>
+        <w:framePr w:w="4033" w:wrap="auto" w:vAnchor="page" w:hAnchor="page" w:x="4610" w:y="17168"/>
+        <w:widowControl w:val="0"/>
+        <w:autoSpaceDE w:val="0"/>
+        <w:autoSpaceDN w:val="0"/>
+        <w:adjustRightInd w:val="0"/>
+        <w:spacing w:before="0" w:after="0" w:line="190" w:lineRule="exact"/>
+        <w:jc w:val="left"/>
+        <w:rPr>
+          <w:rFonts w:ascii="IEVRAA+ArialMT"/>
+          <w:color w:val="000000"/>
+          <w:sz w:val="18"/>
+        </w:rPr>
+      </w:pPr>
+      <w:r>
+        <w:rPr>
+          <w:rFonts w:ascii="IEVRAA+ArialMT"/>
+          <w:color w:val="000000"/>
+          <w:sz w:val="18"/>
+        </w:rPr>
+        <w:t>______________________________</w:t>
+      </w:r>
     </w:p>
     <w:p>
       <w:pPr>
@@ -9952,39 +10233,6 @@
     </w:p>
     <w:p>
       <w:pPr>
-        <w:framePr w:w="4033" w:wrap="auto" w:vAnchor="page" w:hAnchor="page" w:x="4685" w:y="17168"/>
-        <w:widowControl w:val="0"/>
-        <w:autoSpaceDE w:val="0"/>
-        <w:autoSpaceDN w:val="0"/>
-        <w:adjustRightInd w:val="0"/>
-        <w:spacing w:before="0" w:after="0" w:line="190" w:lineRule="exact"/>
-        <w:jc w:val="left"/>
-        <w:rPr>
-          <w:rFonts w:ascii="IEVRAA+ArialMT"/>
-          <w:color w:val="000000"/>
-          <w:sz w:val="18"/>
-        </w:rPr>
-      </w:pPr>
-      <w:r>
-        <w:rPr>
-          <w:rFonts w:ascii="IEVRAA+ArialMT"/>
-          <w:color w:val="000000"/>
-          <w:sz w:val="18"/>
-        </w:rPr>
-        <w:lastRenderedPageBreak/>
-        <w:t>________________________________</w:t>
-      </w:r>
-      <w:r>
-        <w:rPr>
-          <w:rFonts w:ascii="IEVRAA+ArialMT"/>
-          <w:color w:val="000000"/>
-          <w:sz w:val="18"/>
-        </w:rPr>
-        <w:t>____</w:t>
-      </w:r>
-    </w:p>
-    <w:p>
-      <w:pPr>
         <w:framePr w:w="3975" w:wrap="auto" w:vAnchor="page" w:hAnchor="page" w:x="4095" w:y="17119"/>
         <w:widowControl w:val="0"/>
         <w:autoSpaceDE w:val="0"/>
@@ -10015,45 +10263,6 @@
     </w:p>
     <w:p>
       <w:pPr>
-        <w:framePr w:w="4574" w:wrap="auto" w:vAnchor="page" w:hAnchor="page" w:x="3819" w:y="16778"/>
-        <w:widowControl w:val="0"/>
-        <w:autoSpaceDE w:val="0"/>
-        <w:autoSpaceDN w:val="0"/>
-        <w:adjustRightInd w:val="0"/>
-        <w:spacing w:before="26" w:after="0" w:line="211" w:lineRule="exact"/>
-        <w:jc w:val="center"/>
-        <w:rPr>
-          <w:color w:val="000000"/>
-          <w:sz w:val="20"/>
-        </w:rPr>
-      </w:pPr>
-      <w:r>
-        <w:rPr>
-          <w:rFonts w:ascii="EEPAMF+Calibri-Bold"/>
-          <w:color w:val="000000"/>
-          <w:sz w:val="20"/>
-        </w:rPr>
-        <w:t>${</w:t>
-      </w:r>
-      <w:r>
-        <w:rPr>
-          <w:rFonts w:ascii="EEPAMF+Calibri-Bold"/>
-          <w:color w:val="000000"/>
-          <w:sz w:val="20"/>
-        </w:rPr>
-        <w:t>APPROVESIGN</w:t>
-      </w:r>
-      <w:r>
-        <w:rPr>
-          <w:rFonts w:ascii="EEPAMF+Calibri-Bold"/>
-          <w:color w:val="000000"/>
-          <w:sz w:val="20"/>
-        </w:rPr>
-        <w:t>}</w:t>
-      </w:r>
-    </w:p>
-    <w:p>
-      <w:pPr>
         <w:rPr>
           <w:rFonts w:ascii="Arial"/>
           <w:sz w:val="2"/>
@@ -10178,52 +10387,6 @@
           <w:sz w:val="2"/>
         </w:rPr>
       </w:pPr>
-    </w:p>
-    <w:p>
-      <w:pPr>
-        <w:framePr w:w="3807" w:h="412" w:hRule="exact" w:wrap="auto" w:vAnchor="page" w:hAnchor="page" w:x="4205" w:y="16555"/>
-        <w:widowControl w:val="0"/>
-        <w:autoSpaceDE w:val="0"/>
-        <w:autoSpaceDN w:val="0"/>
-        <w:adjustRightInd w:val="0"/>
-        <w:spacing w:before="0" w:after="0" w:line="190" w:lineRule="exact"/>
-        <w:jc w:val="center"/>
-        <w:rPr>
-          <w:rFonts w:ascii="IEVRAA+ArialMT"/>
-          <w:color w:val="000000"/>
-          <w:sz w:val="16"/>
-          <w:szCs w:val="16"/>
-        </w:rPr>
-      </w:pPr>
-      <w:r>
-        <w:rPr>
-          <w:rFonts w:ascii="IEVRAA+ArialMT"/>
-          <w:color w:val="000000"/>
-          <w:sz w:val="16"/>
-          <w:szCs w:val="16"/>
-        </w:rPr>
-        <w:t>${</w:t>
-      </w:r>
-      <w:proofErr w:type="spellStart"/>
-      <w:r>
-        <w:rPr>
-          <w:rFonts w:ascii="IEVRAA+ArialMT"/>
-          <w:color w:val="000000"/>
-          <w:sz w:val="16"/>
-          <w:szCs w:val="16"/>
-        </w:rPr>
-        <w:t>CertifyDate</w:t>
-      </w:r>
-      <w:proofErr w:type="spellEnd"/>
-      <w:r>
-        <w:rPr>
-          <w:rFonts w:ascii="IEVRAA+ArialMT"/>
-          <w:color w:val="000000"/>
-          <w:sz w:val="16"/>
-          <w:szCs w:val="16"/>
-        </w:rPr>
-        <w:t>}</w:t>
-      </w:r>
     </w:p>
     <w:p>
       <w:pPr>
@@ -11162,7 +11325,7 @@
   <w:style w:type="paragraph" w:default="1" w:styleId="Normal">
     <w:name w:val="Normal"/>
     <w:qFormat/>
-    <w:rsid w:val="00491634"/>
+    <w:rsid w:val="00FA181B"/>
     <w:pPr>
       <w:spacing w:before="120" w:after="240"/>
       <w:jc w:val="both"/>

</xml_diff>